<commit_message>
align SRS v4.0, Test Plan v1.1, and SAD v1.1 (itemized requirements, full RTM), added SPRINT_PLAN.md
</commit_message>
<xml_diff>
--- a/docs/SEBM_Software_Test_Plan.docx
+++ b/docs/SEBM_Software_Test_Plan.docx
@@ -44,7 +44,7 @@
         <w:t xml:space="preserve">SRS Reference: </w:t>
       </w:r>
       <w:r>
-        <w:t xml:space="preserve">SRS v3.0 (Approved, 08/09/2026)</w:t>
+        <w:t xml:space="preserve">SRS v4.0 (11/10/2026, itemized requirements in 4.3-4.6)</w:t>
       </w:r>
     </w:p>
     <w:p>
@@ -59,7 +59,7 @@
         <w:t xml:space="preserve">Version: </w:t>
       </w:r>
       <w:r>
-        <w:t xml:space="preserve">1.0</w:t>
+        <w:t xml:space="preserve">1.1</w:t>
       </w:r>
     </w:p>
     <w:p>
@@ -89,7 +89,7 @@
         <w:t xml:space="preserve">Date: </w:t>
       </w:r>
       <w:r>
-        <w:t xml:space="preserve">15-09-2026</w:t>
+        <w:t xml:space="preserve">11-10-2026</w:t>
       </w:r>
     </w:p>
     <w:p>
@@ -133,7 +133,7 @@
         <w:t xml:space="preserve">Purpose: </w:t>
       </w:r>
       <w:r>
-        <w:t xml:space="preserve">This document defines the test plan for the Smart Expense and Budget Management Application (SEBM) v3.0. It outlines objectives, scope, strategy, resources, schedule, and responsibilities for testing the application prior to release.</w:t>
+        <w:t xml:space="preserve">This document defines the test plan for the Smart Expense and Budget Management Application (SEBM), based on SRS v4.0. It outlines objectives, scope, strategy, resources, schedule, and responsibilities for testing the application prior to release.</w:t>
       </w:r>
     </w:p>
     <w:p>
@@ -163,7 +163,7 @@
         <w:t xml:space="preserve">References: </w:t>
       </w:r>
       <w:r>
-        <w:t xml:space="preserve">SEBM SRS v3.0 (Approved), SEBM UML Use-Case and ER Diagrams, applicable data protection regulations, WCAG 2.1 AA accessibility guidelines.</w:t>
+        <w:t xml:space="preserve">SEBM SRS v4.0, SEBM Software Architecture and Design Specification, SEBM UML Use-Case and ER Diagrams, applicable data protection regulations, WCAG 2.1 AA accessibility guidelines.</w:t>
       </w:r>
     </w:p>
     <w:p>
@@ -331,98 +331,345 @@
         <w:spacing w:after="60"/>
       </w:pPr>
       <w:r>
-        <w:t xml:space="preserve">SEBM-F-001..003: Registration, login/session persistence, password reset</w:t>
-      </w:r>
-    </w:p>
-    <w:p>
-      <w:pPr>
-        <w:pStyle w:val="ListParagraph"/>
-        <w:numPr>
-          <w:ilvl w:val="0"/>
-          <w:numId w:val="1"/>
-        </w:numPr>
-        <w:spacing w:after="60"/>
-      </w:pPr>
-      <w:r>
-        <w:t xml:space="preserve">SEBM-F-010..013: Add/edit/delete transaction, attach receipt photo, custom categories</w:t>
-      </w:r>
-    </w:p>
-    <w:p>
-      <w:pPr>
-        <w:pStyle w:val="ListParagraph"/>
-        <w:numPr>
-          <w:ilvl w:val="0"/>
-          <w:numId w:val="1"/>
-        </w:numPr>
-        <w:spacing w:after="60"/>
-      </w:pPr>
-      <w:r>
-        <w:t xml:space="preserve">SEBM-F-020..022: Create/track category-wise and overall monthly budgets, threshold warnings</w:t>
-      </w:r>
-    </w:p>
-    <w:p>
-      <w:pPr>
-        <w:pStyle w:val="ListParagraph"/>
-        <w:numPr>
-          <w:ilvl w:val="0"/>
-          <w:numId w:val="1"/>
-        </w:numPr>
-        <w:spacing w:after="60"/>
-      </w:pPr>
-      <w:r>
-        <w:t xml:space="preserve">SEBM-F-030..031: Multi-account management, transfers between accounts</w:t>
-      </w:r>
-    </w:p>
-    <w:p>
-      <w:pPr>
-        <w:pStyle w:val="ListParagraph"/>
-        <w:numPr>
-          <w:ilvl w:val="0"/>
-          <w:numId w:val="1"/>
-        </w:numPr>
-        <w:spacing w:after="60"/>
-      </w:pPr>
-      <w:r>
-        <w:t xml:space="preserve">SEBM-F-040..042: Spending/income reports and charts, PDF/CSV export, trend comparison</w:t>
-      </w:r>
-    </w:p>
-    <w:p>
-      <w:pPr>
-        <w:pStyle w:val="ListParagraph"/>
-        <w:numPr>
-          <w:ilvl w:val="0"/>
-          <w:numId w:val="1"/>
-        </w:numPr>
-        <w:spacing w:after="60"/>
-      </w:pPr>
-      <w:r>
-        <w:t xml:space="preserve">SEBM-F-050..051: Budget-threshold alerts and bill payment reminders</w:t>
-      </w:r>
-    </w:p>
-    <w:p>
-      <w:pPr>
-        <w:pStyle w:val="ListParagraph"/>
-        <w:numPr>
-          <w:ilvl w:val="0"/>
-          <w:numId w:val="1"/>
-        </w:numPr>
-        <w:spacing w:after="60"/>
-      </w:pPr>
-      <w:r>
-        <w:t xml:space="preserve">SEBM-NF-001..005: Response time, availability, data encryption, accessibility, scalability</w:t>
-      </w:r>
-    </w:p>
-    <w:p>
-      <w:pPr>
-        <w:pStyle w:val="ListParagraph"/>
-        <w:numPr>
-          <w:ilvl w:val="0"/>
-          <w:numId w:val="1"/>
-        </w:numPr>
-        <w:spacing w:after="60"/>
-      </w:pPr>
-      <w:r>
-        <w:t xml:space="preserve">SEBM-SR-001..005: TLS enforcement, password hashing, data-at-rest encryption, session timeout, RBAC</w:t>
+        <w:t xml:space="preserve">SEBM-F-001: Register with unique email and password</w:t>
+      </w:r>
+    </w:p>
+    <w:p>
+      <w:pPr>
+        <w:pStyle w:val="ListParagraph"/>
+        <w:numPr>
+          <w:ilvl w:val="0"/>
+          <w:numId w:val="1"/>
+        </w:numPr>
+        <w:spacing w:after="60"/>
+      </w:pPr>
+      <w:r>
+        <w:t xml:space="preserve">SEBM-F-002: Email/password login with session persistence</w:t>
+      </w:r>
+    </w:p>
+    <w:p>
+      <w:pPr>
+        <w:pStyle w:val="ListParagraph"/>
+        <w:numPr>
+          <w:ilvl w:val="0"/>
+          <w:numId w:val="1"/>
+        </w:numPr>
+        <w:spacing w:after="60"/>
+      </w:pPr>
+      <w:r>
+        <w:t xml:space="preserve">SEBM-F-003: Password reset via time-limited link/OTP</w:t>
+      </w:r>
+    </w:p>
+    <w:p>
+      <w:pPr>
+        <w:pStyle w:val="ListParagraph"/>
+        <w:numPr>
+          <w:ilvl w:val="0"/>
+          <w:numId w:val="1"/>
+        </w:numPr>
+        <w:spacing w:after="60"/>
+      </w:pPr>
+      <w:r>
+        <w:t xml:space="preserve">SEBM-F-010: Add expense/income entry (updates account balance)</w:t>
+      </w:r>
+    </w:p>
+    <w:p>
+      <w:pPr>
+        <w:pStyle w:val="ListParagraph"/>
+        <w:numPr>
+          <w:ilvl w:val="0"/>
+          <w:numId w:val="1"/>
+        </w:numPr>
+        <w:spacing w:after="60"/>
+      </w:pPr>
+      <w:r>
+        <w:t xml:space="preserve">SEBM-F-011: Edit or delete a transaction</w:t>
+      </w:r>
+    </w:p>
+    <w:p>
+      <w:pPr>
+        <w:pStyle w:val="ListParagraph"/>
+        <w:numPr>
+          <w:ilvl w:val="0"/>
+          <w:numId w:val="1"/>
+        </w:numPr>
+        <w:spacing w:after="60"/>
+      </w:pPr>
+      <w:r>
+        <w:t xml:space="preserve">SEBM-F-012: Attach receipt photo to a transaction</w:t>
+      </w:r>
+    </w:p>
+    <w:p>
+      <w:pPr>
+        <w:pStyle w:val="ListParagraph"/>
+        <w:numPr>
+          <w:ilvl w:val="0"/>
+          <w:numId w:val="1"/>
+        </w:numPr>
+        <w:spacing w:after="60"/>
+      </w:pPr>
+      <w:r>
+        <w:t xml:space="preserve">SEBM-F-013: Predefined and custom categories</w:t>
+      </w:r>
+    </w:p>
+    <w:p>
+      <w:pPr>
+        <w:pStyle w:val="ListParagraph"/>
+        <w:numPr>
+          <w:ilvl w:val="0"/>
+          <w:numId w:val="1"/>
+        </w:numPr>
+        <w:spacing w:after="60"/>
+      </w:pPr>
+      <w:r>
+        <w:t xml:space="preserve">SEBM-F-020: Create category-wise or overall monthly budget</w:t>
+      </w:r>
+    </w:p>
+    <w:p>
+      <w:pPr>
+        <w:pStyle w:val="ListParagraph"/>
+        <w:numPr>
+          <w:ilvl w:val="0"/>
+          <w:numId w:val="1"/>
+        </w:numPr>
+        <w:spacing w:after="60"/>
+      </w:pPr>
+      <w:r>
+        <w:t xml:space="preserve">SEBM-F-021: Real-time tracking of spending against budget</w:t>
+      </w:r>
+    </w:p>
+    <w:p>
+      <w:pPr>
+        <w:pStyle w:val="ListParagraph"/>
+        <w:numPr>
+          <w:ilvl w:val="0"/>
+          <w:numId w:val="1"/>
+        </w:numPr>
+        <w:spacing w:after="60"/>
+      </w:pPr>
+      <w:r>
+        <w:t xml:space="preserve">SEBM-F-022: Threshold and limit-exceeded warnings</w:t>
+      </w:r>
+    </w:p>
+    <w:p>
+      <w:pPr>
+        <w:pStyle w:val="ListParagraph"/>
+        <w:numPr>
+          <w:ilvl w:val="0"/>
+          <w:numId w:val="1"/>
+        </w:numPr>
+        <w:spacing w:after="60"/>
+      </w:pPr>
+      <w:r>
+        <w:t xml:space="preserve">SEBM-F-030: Multiple accounts with individual balances</w:t>
+      </w:r>
+    </w:p>
+    <w:p>
+      <w:pPr>
+        <w:pStyle w:val="ListParagraph"/>
+        <w:numPr>
+          <w:ilvl w:val="0"/>
+          <w:numId w:val="1"/>
+        </w:numPr>
+        <w:spacing w:after="60"/>
+      </w:pPr>
+      <w:r>
+        <w:t xml:space="preserve">SEBM-F-031: Atomic transfer between accounts</w:t>
+      </w:r>
+    </w:p>
+    <w:p>
+      <w:pPr>
+        <w:pStyle w:val="ListParagraph"/>
+        <w:numPr>
+          <w:ilvl w:val="0"/>
+          <w:numId w:val="1"/>
+        </w:numPr>
+        <w:spacing w:after="60"/>
+      </w:pPr>
+      <w:r>
+        <w:t xml:space="preserve">SEBM-F-040: Weekly/monthly spending and income reports with charts</w:t>
+      </w:r>
+    </w:p>
+    <w:p>
+      <w:pPr>
+        <w:pStyle w:val="ListParagraph"/>
+        <w:numPr>
+          <w:ilvl w:val="0"/>
+          <w:numId w:val="1"/>
+        </w:numPr>
+        <w:spacing w:after="60"/>
+      </w:pPr>
+      <w:r>
+        <w:t xml:space="preserve">SEBM-F-041: Export report as PDF/CSV</w:t>
+      </w:r>
+    </w:p>
+    <w:p>
+      <w:pPr>
+        <w:pStyle w:val="ListParagraph"/>
+        <w:numPr>
+          <w:ilvl w:val="0"/>
+          <w:numId w:val="1"/>
+        </w:numPr>
+        <w:spacing w:after="60"/>
+      </w:pPr>
+      <w:r>
+        <w:t xml:space="preserve">SEBM-F-042: Period-over-period comparison</w:t>
+      </w:r>
+    </w:p>
+    <w:p>
+      <w:pPr>
+        <w:pStyle w:val="ListParagraph"/>
+        <w:numPr>
+          <w:ilvl w:val="0"/>
+          <w:numId w:val="1"/>
+        </w:numPr>
+        <w:spacing w:after="60"/>
+      </w:pPr>
+      <w:r>
+        <w:t xml:space="preserve">SEBM-F-050: Budget-threshold alert notification (push/email)</w:t>
+      </w:r>
+    </w:p>
+    <w:p>
+      <w:pPr>
+        <w:pStyle w:val="ListParagraph"/>
+        <w:numPr>
+          <w:ilvl w:val="0"/>
+          <w:numId w:val="1"/>
+        </w:numPr>
+        <w:spacing w:after="60"/>
+      </w:pPr>
+      <w:r>
+        <w:t xml:space="preserve">SEBM-F-051: Bill payment reminders</w:t>
+      </w:r>
+    </w:p>
+    <w:p>
+      <w:pPr>
+        <w:pStyle w:val="ListParagraph"/>
+        <w:numPr>
+          <w:ilvl w:val="0"/>
+          <w:numId w:val="1"/>
+        </w:numPr>
+        <w:spacing w:after="60"/>
+      </w:pPr>
+      <w:r>
+        <w:t xml:space="preserve">SEBM-NF-001: Screen load/transaction save within 2s for 90% of requests</w:t>
+      </w:r>
+    </w:p>
+    <w:p>
+      <w:pPr>
+        <w:pStyle w:val="ListParagraph"/>
+        <w:numPr>
+          <w:ilvl w:val="0"/>
+          <w:numId w:val="1"/>
+        </w:numPr>
+        <w:spacing w:after="60"/>
+      </w:pPr>
+      <w:r>
+        <w:t xml:space="preserve">SEBM-NF-002: 99.5% monthly availability</w:t>
+      </w:r>
+    </w:p>
+    <w:p>
+      <w:pPr>
+        <w:pStyle w:val="ListParagraph"/>
+        <w:numPr>
+          <w:ilvl w:val="0"/>
+          <w:numId w:val="1"/>
+        </w:numPr>
+        <w:spacing w:after="60"/>
+      </w:pPr>
+      <w:r>
+        <w:t xml:space="preserve">SEBM-NF-003: Encryption in transit and at rest</w:t>
+      </w:r>
+    </w:p>
+    <w:p>
+      <w:pPr>
+        <w:pStyle w:val="ListParagraph"/>
+        <w:numPr>
+          <w:ilvl w:val="0"/>
+          <w:numId w:val="1"/>
+        </w:numPr>
+        <w:spacing w:after="60"/>
+      </w:pPr>
+      <w:r>
+        <w:t xml:space="preserve">SEBM-NF-004: WCAG 2.1 AA accessibility</w:t>
+      </w:r>
+    </w:p>
+    <w:p>
+      <w:pPr>
+        <w:pStyle w:val="ListParagraph"/>
+        <w:numPr>
+          <w:ilvl w:val="0"/>
+          <w:numId w:val="1"/>
+        </w:numPr>
+        <w:spacing w:after="60"/>
+      </w:pPr>
+      <w:r>
+        <w:t xml:space="preserve">SEBM-NF-005: Scalability to 10,000 concurrent users</w:t>
+      </w:r>
+    </w:p>
+    <w:p>
+      <w:pPr>
+        <w:pStyle w:val="ListParagraph"/>
+        <w:numPr>
+          <w:ilvl w:val="0"/>
+          <w:numId w:val="1"/>
+        </w:numPr>
+        <w:spacing w:after="60"/>
+      </w:pPr>
+      <w:r>
+        <w:t xml:space="preserve">SEBM-SR-001: TLS 1.2+ enforcement</w:t>
+      </w:r>
+    </w:p>
+    <w:p>
+      <w:pPr>
+        <w:pStyle w:val="ListParagraph"/>
+        <w:numPr>
+          <w:ilvl w:val="0"/>
+          <w:numId w:val="1"/>
+        </w:numPr>
+        <w:spacing w:after="60"/>
+      </w:pPr>
+      <w:r>
+        <w:t xml:space="preserve">SEBM-SR-002: Salted password hashing (bcrypt/Argon2)</w:t>
+      </w:r>
+    </w:p>
+    <w:p>
+      <w:pPr>
+        <w:pStyle w:val="ListParagraph"/>
+        <w:numPr>
+          <w:ilvl w:val="0"/>
+          <w:numId w:val="1"/>
+        </w:numPr>
+        <w:spacing w:after="60"/>
+      </w:pPr>
+      <w:r>
+        <w:t xml:space="preserve">SEBM-SR-003: AES-256 encryption of sensitive stored data</w:t>
+      </w:r>
+    </w:p>
+    <w:p>
+      <w:pPr>
+        <w:pStyle w:val="ListParagraph"/>
+        <w:numPr>
+          <w:ilvl w:val="0"/>
+          <w:numId w:val="1"/>
+        </w:numPr>
+        <w:spacing w:after="60"/>
+      </w:pPr>
+      <w:r>
+        <w:t xml:space="preserve">SEBM-SR-004: Automatic session timeout</w:t>
+      </w:r>
+    </w:p>
+    <w:p>
+      <w:pPr>
+        <w:pStyle w:val="ListParagraph"/>
+        <w:numPr>
+          <w:ilvl w:val="0"/>
+          <w:numId w:val="1"/>
+        </w:numPr>
+        <w:spacing w:after="60"/>
+      </w:pPr>
+      <w:r>
+        <w:t xml:space="preserve">SEBM-SR-005: Role-based access control for admin functions</w:t>
       </w:r>
     </w:p>
     <w:p>
@@ -839,7 +1086,7 @@
         <w:t xml:space="preserve">Software: </w:t>
       </w:r>
       <w:r>
-        <w:t xml:space="preserve">SEBM client app v3.0 (mobile and/or web), backend REST API sandbox, notification service sandbox (email/SMS/push), cloud storage sandbox for receipt images.</w:t>
+        <w:t xml:space="preserve">SEBM client app (Sprint 1 build, mobile and/or web), backend REST API sandbox, notification service sandbox (email/SMS/push), cloud storage sandbox for receipt images.</w:t>
       </w:r>
     </w:p>
     <w:p>
@@ -2250,152 +2497,2405 @@
         <w:spacing w:after="120"/>
       </w:pPr>
       <w:r>
-        <w:t xml:space="preserve">The RTM ensures mapping of SRS requirements to test cases. Example mappings:</w:t>
-      </w:r>
-    </w:p>
-    <w:p>
-      <w:pPr>
-        <w:pStyle w:val="ListParagraph"/>
-        <w:numPr>
-          <w:ilvl w:val="0"/>
-          <w:numId w:val="1"/>
-        </w:numPr>
-        <w:spacing w:after="60"/>
-      </w:pPr>
-      <w:r>
-        <w:t xml:space="preserve">SEBM-F-001 (User registration) → TC-Reg-01</w:t>
-      </w:r>
-    </w:p>
-    <w:p>
-      <w:pPr>
-        <w:pStyle w:val="ListParagraph"/>
-        <w:numPr>
-          <w:ilvl w:val="0"/>
-          <w:numId w:val="1"/>
-        </w:numPr>
-        <w:spacing w:after="60"/>
-      </w:pPr>
-      <w:r>
-        <w:t xml:space="preserve">SEBM-F-002 (Login/authentication) → TC-Auth-01</w:t>
-      </w:r>
-    </w:p>
-    <w:p>
-      <w:pPr>
-        <w:pStyle w:val="ListParagraph"/>
-        <w:numPr>
-          <w:ilvl w:val="0"/>
-          <w:numId w:val="1"/>
-        </w:numPr>
-        <w:spacing w:after="60"/>
-      </w:pPr>
-      <w:r>
-        <w:t xml:space="preserve">SEBM-F-003 (Password reset) → TC-Auth-02</w:t>
-      </w:r>
-    </w:p>
-    <w:p>
-      <w:pPr>
-        <w:pStyle w:val="ListParagraph"/>
-        <w:numPr>
-          <w:ilvl w:val="0"/>
-          <w:numId w:val="1"/>
-        </w:numPr>
-        <w:spacing w:after="60"/>
-      </w:pPr>
-      <w:r>
-        <w:t xml:space="preserve">SEBM-F-010 (Add transaction) → TC-Exp-01</w:t>
-      </w:r>
-    </w:p>
-    <w:p>
-      <w:pPr>
-        <w:pStyle w:val="ListParagraph"/>
-        <w:numPr>
-          <w:ilvl w:val="0"/>
-          <w:numId w:val="1"/>
-        </w:numPr>
-        <w:spacing w:after="60"/>
-      </w:pPr>
-      <w:r>
-        <w:t xml:space="preserve">SEBM-F-011 (Edit/delete transaction) → TC-Exp-02</w:t>
-      </w:r>
-    </w:p>
-    <w:p>
-      <w:pPr>
-        <w:pStyle w:val="ListParagraph"/>
-        <w:numPr>
-          <w:ilvl w:val="0"/>
-          <w:numId w:val="1"/>
-        </w:numPr>
-        <w:spacing w:after="60"/>
-      </w:pPr>
-      <w:r>
-        <w:t xml:space="preserve">SEBM-F-020 (Create budget) → TC-Bud-01</w:t>
-      </w:r>
-    </w:p>
-    <w:p>
-      <w:pPr>
-        <w:pStyle w:val="ListParagraph"/>
-        <w:numPr>
-          <w:ilvl w:val="0"/>
-          <w:numId w:val="1"/>
-        </w:numPr>
-        <w:spacing w:after="60"/>
-      </w:pPr>
-      <w:r>
-        <w:t xml:space="preserve">SEBM-F-040 (Generate report) → TC-Rep-01</w:t>
-      </w:r>
-    </w:p>
-    <w:p>
-      <w:pPr>
-        <w:pStyle w:val="ListParagraph"/>
-        <w:numPr>
-          <w:ilvl w:val="0"/>
-          <w:numId w:val="1"/>
-        </w:numPr>
-        <w:spacing w:after="60"/>
-      </w:pPr>
-      <w:r>
-        <w:t xml:space="preserve">SEBM-NF-001 (Response time) → TC-Perf-01</w:t>
-      </w:r>
-    </w:p>
-    <w:p>
-      <w:pPr>
-        <w:pStyle w:val="ListParagraph"/>
-        <w:numPr>
-          <w:ilvl w:val="0"/>
-          <w:numId w:val="1"/>
-        </w:numPr>
-        <w:spacing w:after="60"/>
-      </w:pPr>
-      <w:r>
-        <w:t xml:space="preserve">SEBM-SR-001 (TLS enforcement) → TC-Sec-02</w:t>
-      </w:r>
-    </w:p>
-    <w:p>
-      <w:pPr>
-        <w:pStyle w:val="ListParagraph"/>
-        <w:numPr>
-          <w:ilvl w:val="0"/>
-          <w:numId w:val="1"/>
-        </w:numPr>
-        <w:spacing w:after="60"/>
-      </w:pPr>
-      <w:r>
-        <w:t xml:space="preserve">SEBM-SR-002 (Password hashing) → TC-Sec-03</w:t>
-      </w:r>
-    </w:p>
-    <w:p>
-      <w:pPr>
-        <w:pStyle w:val="ListParagraph"/>
-        <w:numPr>
-          <w:ilvl w:val="0"/>
-          <w:numId w:val="1"/>
-        </w:numPr>
-        <w:spacing w:after="60"/>
-      </w:pPr>
-      <w:r>
-        <w:t xml:space="preserve">SEBM-SR-005 (RBAC for admin functions) → TC-Sec-06</w:t>
-      </w:r>
-    </w:p>
+        <w:t xml:space="preserve">The RTM ensures every SRS requirement maps to at least one test case. The table below mirrors the RTM in SRS Section 8 (all 27 requirement IDs):</w:t>
+      </w:r>
+    </w:p>
+    <w:tbl>
+      <w:tblPr>
+        <w:tblW w:type="dxa" w:w="10228"/>
+        <w:tblBorders>
+          <w:top w:val="single" w:color="auto" w:sz="4"/>
+          <w:left w:val="single" w:color="auto" w:sz="4"/>
+          <w:bottom w:val="single" w:color="auto" w:sz="4"/>
+          <w:right w:val="single" w:color="auto" w:sz="4"/>
+          <w:insideH w:val="single" w:color="auto" w:sz="4"/>
+          <w:insideV w:val="single" w:color="auto" w:sz="4"/>
+        </w:tblBorders>
+      </w:tblPr>
+      <w:tblGrid>
+        <w:gridCol w:w="2600"/>
+        <w:gridCol w:w="3000"/>
+        <w:gridCol w:w="4628"/>
+      </w:tblGrid>
+      <w:tr>
+        <w:trPr>
+          <w:tblHeader/>
+        </w:trPr>
+        <w:tc>
+          <w:tcPr>
+            <w:tcW w:type="dxa" w:w="2600"/>
+            <w:tcBorders>
+              <w:top w:val="single" w:color="999999" w:sz="4"/>
+              <w:left w:val="single" w:color="999999" w:sz="4"/>
+              <w:bottom w:val="single" w:color="999999" w:sz="4"/>
+              <w:right w:val="single" w:color="999999" w:sz="4"/>
+            </w:tcBorders>
+            <w:shd w:fill="1F6391" w:val="clear"/>
+            <w:tcMar>
+              <w:top w:type="dxa" w:w="60"/>
+              <w:left w:type="dxa" w:w="80"/>
+              <w:bottom w:type="dxa" w:w="60"/>
+              <w:right w:type="dxa" w:w="80"/>
+            </w:tcMar>
+            <w:vAlign w:val="center"/>
+          </w:tcPr>
+          <w:p>
+            <w:r>
+              <w:rPr>
+                <w:b/>
+                <w:bCs/>
+                <w:color w:val="FFFFFF"/>
+                <w:sz w:val="20"/>
+                <w:szCs w:val="20"/>
+              </w:rPr>
+              <w:t xml:space="preserve">Req ID</w:t>
+            </w:r>
+          </w:p>
+        </w:tc>
+        <w:tc>
+          <w:tcPr>
+            <w:tcW w:type="dxa" w:w="3000"/>
+            <w:tcBorders>
+              <w:top w:val="single" w:color="999999" w:sz="4"/>
+              <w:left w:val="single" w:color="999999" w:sz="4"/>
+              <w:bottom w:val="single" w:color="999999" w:sz="4"/>
+              <w:right w:val="single" w:color="999999" w:sz="4"/>
+            </w:tcBorders>
+            <w:shd w:fill="1F6391" w:val="clear"/>
+            <w:tcMar>
+              <w:top w:type="dxa" w:w="60"/>
+              <w:left w:type="dxa" w:w="80"/>
+              <w:bottom w:type="dxa" w:w="60"/>
+              <w:right w:type="dxa" w:w="80"/>
+            </w:tcMar>
+            <w:vAlign w:val="center"/>
+          </w:tcPr>
+          <w:p>
+            <w:r>
+              <w:rPr>
+                <w:b/>
+                <w:bCs/>
+                <w:color w:val="FFFFFF"/>
+                <w:sz w:val="20"/>
+                <w:szCs w:val="20"/>
+              </w:rPr>
+              <w:t xml:space="preserve">Test case(s)</w:t>
+            </w:r>
+          </w:p>
+        </w:tc>
+        <w:tc>
+          <w:tcPr>
+            <w:tcW w:type="dxa" w:w="4628"/>
+            <w:tcBorders>
+              <w:top w:val="single" w:color="999999" w:sz="4"/>
+              <w:left w:val="single" w:color="999999" w:sz="4"/>
+              <w:bottom w:val="single" w:color="999999" w:sz="4"/>
+              <w:right w:val="single" w:color="999999" w:sz="4"/>
+            </w:tcBorders>
+            <w:shd w:fill="1F6391" w:val="clear"/>
+            <w:tcMar>
+              <w:top w:type="dxa" w:w="60"/>
+              <w:left w:type="dxa" w:w="80"/>
+              <w:bottom w:type="dxa" w:w="60"/>
+              <w:right w:type="dxa" w:w="80"/>
+            </w:tcMar>
+            <w:vAlign w:val="center"/>
+          </w:tcPr>
+          <w:p>
+            <w:r>
+              <w:rPr>
+                <w:b/>
+                <w:bCs/>
+                <w:color w:val="FFFFFF"/>
+                <w:sz w:val="20"/>
+                <w:szCs w:val="20"/>
+              </w:rPr>
+              <w:t xml:space="preserve">Test level / type</w:t>
+            </w:r>
+          </w:p>
+        </w:tc>
+      </w:tr>
+      <w:tr>
+        <w:tc>
+          <w:tcPr>
+            <w:tcW w:type="dxa" w:w="2600"/>
+            <w:tcBorders>
+              <w:top w:val="single" w:color="999999" w:sz="4"/>
+              <w:left w:val="single" w:color="999999" w:sz="4"/>
+              <w:bottom w:val="single" w:color="999999" w:sz="4"/>
+              <w:right w:val="single" w:color="999999" w:sz="4"/>
+            </w:tcBorders>
+            <w:tcMar>
+              <w:top w:type="dxa" w:w="60"/>
+              <w:left w:type="dxa" w:w="80"/>
+              <w:bottom w:type="dxa" w:w="60"/>
+              <w:right w:type="dxa" w:w="80"/>
+            </w:tcMar>
+            <w:vAlign w:val="center"/>
+          </w:tcPr>
+          <w:p>
+            <w:r>
+              <w:rPr>
+                <w:sz w:val="19"/>
+                <w:szCs w:val="19"/>
+              </w:rPr>
+              <w:t xml:space="preserve">SEBM-F-001</w:t>
+            </w:r>
+          </w:p>
+        </w:tc>
+        <w:tc>
+          <w:tcPr>
+            <w:tcW w:type="dxa" w:w="3000"/>
+            <w:tcBorders>
+              <w:top w:val="single" w:color="999999" w:sz="4"/>
+              <w:left w:val="single" w:color="999999" w:sz="4"/>
+              <w:bottom w:val="single" w:color="999999" w:sz="4"/>
+              <w:right w:val="single" w:color="999999" w:sz="4"/>
+            </w:tcBorders>
+            <w:tcMar>
+              <w:top w:type="dxa" w:w="60"/>
+              <w:left w:type="dxa" w:w="80"/>
+              <w:bottom w:type="dxa" w:w="60"/>
+              <w:right w:type="dxa" w:w="80"/>
+            </w:tcMar>
+            <w:vAlign w:val="center"/>
+          </w:tcPr>
+          <w:p>
+            <w:r>
+              <w:rPr>
+                <w:sz w:val="19"/>
+                <w:szCs w:val="19"/>
+              </w:rPr>
+              <w:t xml:space="preserve">TC-Reg-01</w:t>
+            </w:r>
+          </w:p>
+        </w:tc>
+        <w:tc>
+          <w:tcPr>
+            <w:tcW w:type="dxa" w:w="4628"/>
+            <w:tcBorders>
+              <w:top w:val="single" w:color="999999" w:sz="4"/>
+              <w:left w:val="single" w:color="999999" w:sz="4"/>
+              <w:bottom w:val="single" w:color="999999" w:sz="4"/>
+              <w:right w:val="single" w:color="999999" w:sz="4"/>
+            </w:tcBorders>
+            <w:tcMar>
+              <w:top w:type="dxa" w:w="60"/>
+              <w:left w:type="dxa" w:w="80"/>
+              <w:bottom w:type="dxa" w:w="60"/>
+              <w:right w:type="dxa" w:w="80"/>
+            </w:tcMar>
+            <w:vAlign w:val="center"/>
+          </w:tcPr>
+          <w:p>
+            <w:r>
+              <w:rPr>
+                <w:sz w:val="19"/>
+                <w:szCs w:val="19"/>
+              </w:rPr>
+              <w:t xml:space="preserve">Unit, Integration</w:t>
+            </w:r>
+          </w:p>
+        </w:tc>
+      </w:tr>
+      <w:tr>
+        <w:tc>
+          <w:tcPr>
+            <w:tcW w:type="dxa" w:w="2600"/>
+            <w:tcBorders>
+              <w:top w:val="single" w:color="999999" w:sz="4"/>
+              <w:left w:val="single" w:color="999999" w:sz="4"/>
+              <w:bottom w:val="single" w:color="999999" w:sz="4"/>
+              <w:right w:val="single" w:color="999999" w:sz="4"/>
+            </w:tcBorders>
+            <w:shd w:fill="F2F2F2" w:val="clear"/>
+            <w:tcMar>
+              <w:top w:type="dxa" w:w="60"/>
+              <w:left w:type="dxa" w:w="80"/>
+              <w:bottom w:type="dxa" w:w="60"/>
+              <w:right w:type="dxa" w:w="80"/>
+            </w:tcMar>
+            <w:vAlign w:val="center"/>
+          </w:tcPr>
+          <w:p>
+            <w:r>
+              <w:rPr>
+                <w:sz w:val="19"/>
+                <w:szCs w:val="19"/>
+              </w:rPr>
+              <w:t xml:space="preserve">SEBM-F-002</w:t>
+            </w:r>
+          </w:p>
+        </w:tc>
+        <w:tc>
+          <w:tcPr>
+            <w:tcW w:type="dxa" w:w="3000"/>
+            <w:tcBorders>
+              <w:top w:val="single" w:color="999999" w:sz="4"/>
+              <w:left w:val="single" w:color="999999" w:sz="4"/>
+              <w:bottom w:val="single" w:color="999999" w:sz="4"/>
+              <w:right w:val="single" w:color="999999" w:sz="4"/>
+            </w:tcBorders>
+            <w:shd w:fill="F2F2F2" w:val="clear"/>
+            <w:tcMar>
+              <w:top w:type="dxa" w:w="60"/>
+              <w:left w:type="dxa" w:w="80"/>
+              <w:bottom w:type="dxa" w:w="60"/>
+              <w:right w:type="dxa" w:w="80"/>
+            </w:tcMar>
+            <w:vAlign w:val="center"/>
+          </w:tcPr>
+          <w:p>
+            <w:r>
+              <w:rPr>
+                <w:sz w:val="19"/>
+                <w:szCs w:val="19"/>
+              </w:rPr>
+              <w:t xml:space="preserve">TC-Auth-01</w:t>
+            </w:r>
+          </w:p>
+        </w:tc>
+        <w:tc>
+          <w:tcPr>
+            <w:tcW w:type="dxa" w:w="4628"/>
+            <w:tcBorders>
+              <w:top w:val="single" w:color="999999" w:sz="4"/>
+              <w:left w:val="single" w:color="999999" w:sz="4"/>
+              <w:bottom w:val="single" w:color="999999" w:sz="4"/>
+              <w:right w:val="single" w:color="999999" w:sz="4"/>
+            </w:tcBorders>
+            <w:shd w:fill="F2F2F2" w:val="clear"/>
+            <w:tcMar>
+              <w:top w:type="dxa" w:w="60"/>
+              <w:left w:type="dxa" w:w="80"/>
+              <w:bottom w:type="dxa" w:w="60"/>
+              <w:right w:type="dxa" w:w="80"/>
+            </w:tcMar>
+            <w:vAlign w:val="center"/>
+          </w:tcPr>
+          <w:p>
+            <w:r>
+              <w:rPr>
+                <w:sz w:val="19"/>
+                <w:szCs w:val="19"/>
+              </w:rPr>
+              <w:t xml:space="preserve">Unit, Integration</w:t>
+            </w:r>
+          </w:p>
+        </w:tc>
+      </w:tr>
+      <w:tr>
+        <w:tc>
+          <w:tcPr>
+            <w:tcW w:type="dxa" w:w="2600"/>
+            <w:tcBorders>
+              <w:top w:val="single" w:color="999999" w:sz="4"/>
+              <w:left w:val="single" w:color="999999" w:sz="4"/>
+              <w:bottom w:val="single" w:color="999999" w:sz="4"/>
+              <w:right w:val="single" w:color="999999" w:sz="4"/>
+            </w:tcBorders>
+            <w:tcMar>
+              <w:top w:type="dxa" w:w="60"/>
+              <w:left w:type="dxa" w:w="80"/>
+              <w:bottom w:type="dxa" w:w="60"/>
+              <w:right w:type="dxa" w:w="80"/>
+            </w:tcMar>
+            <w:vAlign w:val="center"/>
+          </w:tcPr>
+          <w:p>
+            <w:r>
+              <w:rPr>
+                <w:sz w:val="19"/>
+                <w:szCs w:val="19"/>
+              </w:rPr>
+              <w:t xml:space="preserve">SEBM-F-003</w:t>
+            </w:r>
+          </w:p>
+        </w:tc>
+        <w:tc>
+          <w:tcPr>
+            <w:tcW w:type="dxa" w:w="3000"/>
+            <w:tcBorders>
+              <w:top w:val="single" w:color="999999" w:sz="4"/>
+              <w:left w:val="single" w:color="999999" w:sz="4"/>
+              <w:bottom w:val="single" w:color="999999" w:sz="4"/>
+              <w:right w:val="single" w:color="999999" w:sz="4"/>
+            </w:tcBorders>
+            <w:tcMar>
+              <w:top w:type="dxa" w:w="60"/>
+              <w:left w:type="dxa" w:w="80"/>
+              <w:bottom w:type="dxa" w:w="60"/>
+              <w:right w:type="dxa" w:w="80"/>
+            </w:tcMar>
+            <w:vAlign w:val="center"/>
+          </w:tcPr>
+          <w:p>
+            <w:r>
+              <w:rPr>
+                <w:sz w:val="19"/>
+                <w:szCs w:val="19"/>
+              </w:rPr>
+              <w:t xml:space="preserve">TC-Auth-02</w:t>
+            </w:r>
+          </w:p>
+        </w:tc>
+        <w:tc>
+          <w:tcPr>
+            <w:tcW w:type="dxa" w:w="4628"/>
+            <w:tcBorders>
+              <w:top w:val="single" w:color="999999" w:sz="4"/>
+              <w:left w:val="single" w:color="999999" w:sz="4"/>
+              <w:bottom w:val="single" w:color="999999" w:sz="4"/>
+              <w:right w:val="single" w:color="999999" w:sz="4"/>
+            </w:tcBorders>
+            <w:tcMar>
+              <w:top w:type="dxa" w:w="60"/>
+              <w:left w:type="dxa" w:w="80"/>
+              <w:bottom w:type="dxa" w:w="60"/>
+              <w:right w:type="dxa" w:w="80"/>
+            </w:tcMar>
+            <w:vAlign w:val="center"/>
+          </w:tcPr>
+          <w:p>
+            <w:r>
+              <w:rPr>
+                <w:sz w:val="19"/>
+                <w:szCs w:val="19"/>
+              </w:rPr>
+              <w:t xml:space="preserve">Unit, Integration</w:t>
+            </w:r>
+          </w:p>
+        </w:tc>
+      </w:tr>
+      <w:tr>
+        <w:tc>
+          <w:tcPr>
+            <w:tcW w:type="dxa" w:w="2600"/>
+            <w:tcBorders>
+              <w:top w:val="single" w:color="999999" w:sz="4"/>
+              <w:left w:val="single" w:color="999999" w:sz="4"/>
+              <w:bottom w:val="single" w:color="999999" w:sz="4"/>
+              <w:right w:val="single" w:color="999999" w:sz="4"/>
+            </w:tcBorders>
+            <w:shd w:fill="F2F2F2" w:val="clear"/>
+            <w:tcMar>
+              <w:top w:type="dxa" w:w="60"/>
+              <w:left w:type="dxa" w:w="80"/>
+              <w:bottom w:type="dxa" w:w="60"/>
+              <w:right w:type="dxa" w:w="80"/>
+            </w:tcMar>
+            <w:vAlign w:val="center"/>
+          </w:tcPr>
+          <w:p>
+            <w:r>
+              <w:rPr>
+                <w:sz w:val="19"/>
+                <w:szCs w:val="19"/>
+              </w:rPr>
+              <w:t xml:space="preserve">SEBM-F-010</w:t>
+            </w:r>
+          </w:p>
+        </w:tc>
+        <w:tc>
+          <w:tcPr>
+            <w:tcW w:type="dxa" w:w="3000"/>
+            <w:tcBorders>
+              <w:top w:val="single" w:color="999999" w:sz="4"/>
+              <w:left w:val="single" w:color="999999" w:sz="4"/>
+              <w:bottom w:val="single" w:color="999999" w:sz="4"/>
+              <w:right w:val="single" w:color="999999" w:sz="4"/>
+            </w:tcBorders>
+            <w:shd w:fill="F2F2F2" w:val="clear"/>
+            <w:tcMar>
+              <w:top w:type="dxa" w:w="60"/>
+              <w:left w:type="dxa" w:w="80"/>
+              <w:bottom w:type="dxa" w:w="60"/>
+              <w:right w:type="dxa" w:w="80"/>
+            </w:tcMar>
+            <w:vAlign w:val="center"/>
+          </w:tcPr>
+          <w:p>
+            <w:r>
+              <w:rPr>
+                <w:sz w:val="19"/>
+                <w:szCs w:val="19"/>
+              </w:rPr>
+              <w:t xml:space="preserve">TC-Exp-01</w:t>
+            </w:r>
+          </w:p>
+        </w:tc>
+        <w:tc>
+          <w:tcPr>
+            <w:tcW w:type="dxa" w:w="4628"/>
+            <w:tcBorders>
+              <w:top w:val="single" w:color="999999" w:sz="4"/>
+              <w:left w:val="single" w:color="999999" w:sz="4"/>
+              <w:bottom w:val="single" w:color="999999" w:sz="4"/>
+              <w:right w:val="single" w:color="999999" w:sz="4"/>
+            </w:tcBorders>
+            <w:shd w:fill="F2F2F2" w:val="clear"/>
+            <w:tcMar>
+              <w:top w:type="dxa" w:w="60"/>
+              <w:left w:type="dxa" w:w="80"/>
+              <w:bottom w:type="dxa" w:w="60"/>
+              <w:right w:type="dxa" w:w="80"/>
+            </w:tcMar>
+            <w:vAlign w:val="center"/>
+          </w:tcPr>
+          <w:p>
+            <w:r>
+              <w:rPr>
+                <w:sz w:val="19"/>
+                <w:szCs w:val="19"/>
+              </w:rPr>
+              <w:t xml:space="preserve">Unit, Integration</w:t>
+            </w:r>
+          </w:p>
+        </w:tc>
+      </w:tr>
+      <w:tr>
+        <w:tc>
+          <w:tcPr>
+            <w:tcW w:type="dxa" w:w="2600"/>
+            <w:tcBorders>
+              <w:top w:val="single" w:color="999999" w:sz="4"/>
+              <w:left w:val="single" w:color="999999" w:sz="4"/>
+              <w:bottom w:val="single" w:color="999999" w:sz="4"/>
+              <w:right w:val="single" w:color="999999" w:sz="4"/>
+            </w:tcBorders>
+            <w:tcMar>
+              <w:top w:type="dxa" w:w="60"/>
+              <w:left w:type="dxa" w:w="80"/>
+              <w:bottom w:type="dxa" w:w="60"/>
+              <w:right w:type="dxa" w:w="80"/>
+            </w:tcMar>
+            <w:vAlign w:val="center"/>
+          </w:tcPr>
+          <w:p>
+            <w:r>
+              <w:rPr>
+                <w:sz w:val="19"/>
+                <w:szCs w:val="19"/>
+              </w:rPr>
+              <w:t xml:space="preserve">SEBM-F-011</w:t>
+            </w:r>
+          </w:p>
+        </w:tc>
+        <w:tc>
+          <w:tcPr>
+            <w:tcW w:type="dxa" w:w="3000"/>
+            <w:tcBorders>
+              <w:top w:val="single" w:color="999999" w:sz="4"/>
+              <w:left w:val="single" w:color="999999" w:sz="4"/>
+              <w:bottom w:val="single" w:color="999999" w:sz="4"/>
+              <w:right w:val="single" w:color="999999" w:sz="4"/>
+            </w:tcBorders>
+            <w:tcMar>
+              <w:top w:type="dxa" w:w="60"/>
+              <w:left w:type="dxa" w:w="80"/>
+              <w:bottom w:type="dxa" w:w="60"/>
+              <w:right w:type="dxa" w:w="80"/>
+            </w:tcMar>
+            <w:vAlign w:val="center"/>
+          </w:tcPr>
+          <w:p>
+            <w:r>
+              <w:rPr>
+                <w:sz w:val="19"/>
+                <w:szCs w:val="19"/>
+              </w:rPr>
+              <w:t xml:space="preserve">TC-Exp-02</w:t>
+            </w:r>
+          </w:p>
+        </w:tc>
+        <w:tc>
+          <w:tcPr>
+            <w:tcW w:type="dxa" w:w="4628"/>
+            <w:tcBorders>
+              <w:top w:val="single" w:color="999999" w:sz="4"/>
+              <w:left w:val="single" w:color="999999" w:sz="4"/>
+              <w:bottom w:val="single" w:color="999999" w:sz="4"/>
+              <w:right w:val="single" w:color="999999" w:sz="4"/>
+            </w:tcBorders>
+            <w:tcMar>
+              <w:top w:type="dxa" w:w="60"/>
+              <w:left w:type="dxa" w:w="80"/>
+              <w:bottom w:type="dxa" w:w="60"/>
+              <w:right w:type="dxa" w:w="80"/>
+            </w:tcMar>
+            <w:vAlign w:val="center"/>
+          </w:tcPr>
+          <w:p>
+            <w:r>
+              <w:rPr>
+                <w:sz w:val="19"/>
+                <w:szCs w:val="19"/>
+              </w:rPr>
+              <w:t xml:space="preserve">Unit, Integration</w:t>
+            </w:r>
+          </w:p>
+        </w:tc>
+      </w:tr>
+      <w:tr>
+        <w:tc>
+          <w:tcPr>
+            <w:tcW w:type="dxa" w:w="2600"/>
+            <w:tcBorders>
+              <w:top w:val="single" w:color="999999" w:sz="4"/>
+              <w:left w:val="single" w:color="999999" w:sz="4"/>
+              <w:bottom w:val="single" w:color="999999" w:sz="4"/>
+              <w:right w:val="single" w:color="999999" w:sz="4"/>
+            </w:tcBorders>
+            <w:shd w:fill="F2F2F2" w:val="clear"/>
+            <w:tcMar>
+              <w:top w:type="dxa" w:w="60"/>
+              <w:left w:type="dxa" w:w="80"/>
+              <w:bottom w:type="dxa" w:w="60"/>
+              <w:right w:type="dxa" w:w="80"/>
+            </w:tcMar>
+            <w:vAlign w:val="center"/>
+          </w:tcPr>
+          <w:p>
+            <w:r>
+              <w:rPr>
+                <w:sz w:val="19"/>
+                <w:szCs w:val="19"/>
+              </w:rPr>
+              <w:t xml:space="preserve">SEBM-F-012</w:t>
+            </w:r>
+          </w:p>
+        </w:tc>
+        <w:tc>
+          <w:tcPr>
+            <w:tcW w:type="dxa" w:w="3000"/>
+            <w:tcBorders>
+              <w:top w:val="single" w:color="999999" w:sz="4"/>
+              <w:left w:val="single" w:color="999999" w:sz="4"/>
+              <w:bottom w:val="single" w:color="999999" w:sz="4"/>
+              <w:right w:val="single" w:color="999999" w:sz="4"/>
+            </w:tcBorders>
+            <w:shd w:fill="F2F2F2" w:val="clear"/>
+            <w:tcMar>
+              <w:top w:type="dxa" w:w="60"/>
+              <w:left w:type="dxa" w:w="80"/>
+              <w:bottom w:type="dxa" w:w="60"/>
+              <w:right w:type="dxa" w:w="80"/>
+            </w:tcMar>
+            <w:vAlign w:val="center"/>
+          </w:tcPr>
+          <w:p>
+            <w:r>
+              <w:rPr>
+                <w:sz w:val="19"/>
+                <w:szCs w:val="19"/>
+              </w:rPr>
+              <w:t xml:space="preserve">TC-Exp-03</w:t>
+            </w:r>
+          </w:p>
+        </w:tc>
+        <w:tc>
+          <w:tcPr>
+            <w:tcW w:type="dxa" w:w="4628"/>
+            <w:tcBorders>
+              <w:top w:val="single" w:color="999999" w:sz="4"/>
+              <w:left w:val="single" w:color="999999" w:sz="4"/>
+              <w:bottom w:val="single" w:color="999999" w:sz="4"/>
+              <w:right w:val="single" w:color="999999" w:sz="4"/>
+            </w:tcBorders>
+            <w:shd w:fill="F2F2F2" w:val="clear"/>
+            <w:tcMar>
+              <w:top w:type="dxa" w:w="60"/>
+              <w:left w:type="dxa" w:w="80"/>
+              <w:bottom w:type="dxa" w:w="60"/>
+              <w:right w:type="dxa" w:w="80"/>
+            </w:tcMar>
+            <w:vAlign w:val="center"/>
+          </w:tcPr>
+          <w:p>
+            <w:r>
+              <w:rPr>
+                <w:sz w:val="19"/>
+                <w:szCs w:val="19"/>
+              </w:rPr>
+              <w:t xml:space="preserve">Integration</w:t>
+            </w:r>
+          </w:p>
+        </w:tc>
+      </w:tr>
+      <w:tr>
+        <w:tc>
+          <w:tcPr>
+            <w:tcW w:type="dxa" w:w="2600"/>
+            <w:tcBorders>
+              <w:top w:val="single" w:color="999999" w:sz="4"/>
+              <w:left w:val="single" w:color="999999" w:sz="4"/>
+              <w:bottom w:val="single" w:color="999999" w:sz="4"/>
+              <w:right w:val="single" w:color="999999" w:sz="4"/>
+            </w:tcBorders>
+            <w:tcMar>
+              <w:top w:type="dxa" w:w="60"/>
+              <w:left w:type="dxa" w:w="80"/>
+              <w:bottom w:type="dxa" w:w="60"/>
+              <w:right w:type="dxa" w:w="80"/>
+            </w:tcMar>
+            <w:vAlign w:val="center"/>
+          </w:tcPr>
+          <w:p>
+            <w:r>
+              <w:rPr>
+                <w:sz w:val="19"/>
+                <w:szCs w:val="19"/>
+              </w:rPr>
+              <w:t xml:space="preserve">SEBM-F-013</w:t>
+            </w:r>
+          </w:p>
+        </w:tc>
+        <w:tc>
+          <w:tcPr>
+            <w:tcW w:type="dxa" w:w="3000"/>
+            <w:tcBorders>
+              <w:top w:val="single" w:color="999999" w:sz="4"/>
+              <w:left w:val="single" w:color="999999" w:sz="4"/>
+              <w:bottom w:val="single" w:color="999999" w:sz="4"/>
+              <w:right w:val="single" w:color="999999" w:sz="4"/>
+            </w:tcBorders>
+            <w:tcMar>
+              <w:top w:type="dxa" w:w="60"/>
+              <w:left w:type="dxa" w:w="80"/>
+              <w:bottom w:type="dxa" w:w="60"/>
+              <w:right w:type="dxa" w:w="80"/>
+            </w:tcMar>
+            <w:vAlign w:val="center"/>
+          </w:tcPr>
+          <w:p>
+            <w:r>
+              <w:rPr>
+                <w:sz w:val="19"/>
+                <w:szCs w:val="19"/>
+              </w:rPr>
+              <w:t xml:space="preserve">TC-Exp-04</w:t>
+            </w:r>
+          </w:p>
+        </w:tc>
+        <w:tc>
+          <w:tcPr>
+            <w:tcW w:type="dxa" w:w="4628"/>
+            <w:tcBorders>
+              <w:top w:val="single" w:color="999999" w:sz="4"/>
+              <w:left w:val="single" w:color="999999" w:sz="4"/>
+              <w:bottom w:val="single" w:color="999999" w:sz="4"/>
+              <w:right w:val="single" w:color="999999" w:sz="4"/>
+            </w:tcBorders>
+            <w:tcMar>
+              <w:top w:type="dxa" w:w="60"/>
+              <w:left w:type="dxa" w:w="80"/>
+              <w:bottom w:type="dxa" w:w="60"/>
+              <w:right w:type="dxa" w:w="80"/>
+            </w:tcMar>
+            <w:vAlign w:val="center"/>
+          </w:tcPr>
+          <w:p>
+            <w:r>
+              <w:rPr>
+                <w:sz w:val="19"/>
+                <w:szCs w:val="19"/>
+              </w:rPr>
+              <w:t xml:space="preserve">Unit, Integration</w:t>
+            </w:r>
+          </w:p>
+        </w:tc>
+      </w:tr>
+      <w:tr>
+        <w:tc>
+          <w:tcPr>
+            <w:tcW w:type="dxa" w:w="2600"/>
+            <w:tcBorders>
+              <w:top w:val="single" w:color="999999" w:sz="4"/>
+              <w:left w:val="single" w:color="999999" w:sz="4"/>
+              <w:bottom w:val="single" w:color="999999" w:sz="4"/>
+              <w:right w:val="single" w:color="999999" w:sz="4"/>
+            </w:tcBorders>
+            <w:shd w:fill="F2F2F2" w:val="clear"/>
+            <w:tcMar>
+              <w:top w:type="dxa" w:w="60"/>
+              <w:left w:type="dxa" w:w="80"/>
+              <w:bottom w:type="dxa" w:w="60"/>
+              <w:right w:type="dxa" w:w="80"/>
+            </w:tcMar>
+            <w:vAlign w:val="center"/>
+          </w:tcPr>
+          <w:p>
+            <w:r>
+              <w:rPr>
+                <w:sz w:val="19"/>
+                <w:szCs w:val="19"/>
+              </w:rPr>
+              <w:t xml:space="preserve">SEBM-F-020</w:t>
+            </w:r>
+          </w:p>
+        </w:tc>
+        <w:tc>
+          <w:tcPr>
+            <w:tcW w:type="dxa" w:w="3000"/>
+            <w:tcBorders>
+              <w:top w:val="single" w:color="999999" w:sz="4"/>
+              <w:left w:val="single" w:color="999999" w:sz="4"/>
+              <w:bottom w:val="single" w:color="999999" w:sz="4"/>
+              <w:right w:val="single" w:color="999999" w:sz="4"/>
+            </w:tcBorders>
+            <w:shd w:fill="F2F2F2" w:val="clear"/>
+            <w:tcMar>
+              <w:top w:type="dxa" w:w="60"/>
+              <w:left w:type="dxa" w:w="80"/>
+              <w:bottom w:type="dxa" w:w="60"/>
+              <w:right w:type="dxa" w:w="80"/>
+            </w:tcMar>
+            <w:vAlign w:val="center"/>
+          </w:tcPr>
+          <w:p>
+            <w:r>
+              <w:rPr>
+                <w:sz w:val="19"/>
+                <w:szCs w:val="19"/>
+              </w:rPr>
+              <w:t xml:space="preserve">TC-Bud-01</w:t>
+            </w:r>
+          </w:p>
+        </w:tc>
+        <w:tc>
+          <w:tcPr>
+            <w:tcW w:type="dxa" w:w="4628"/>
+            <w:tcBorders>
+              <w:top w:val="single" w:color="999999" w:sz="4"/>
+              <w:left w:val="single" w:color="999999" w:sz="4"/>
+              <w:bottom w:val="single" w:color="999999" w:sz="4"/>
+              <w:right w:val="single" w:color="999999" w:sz="4"/>
+            </w:tcBorders>
+            <w:shd w:fill="F2F2F2" w:val="clear"/>
+            <w:tcMar>
+              <w:top w:type="dxa" w:w="60"/>
+              <w:left w:type="dxa" w:w="80"/>
+              <w:bottom w:type="dxa" w:w="60"/>
+              <w:right w:type="dxa" w:w="80"/>
+            </w:tcMar>
+            <w:vAlign w:val="center"/>
+          </w:tcPr>
+          <w:p>
+            <w:r>
+              <w:rPr>
+                <w:sz w:val="19"/>
+                <w:szCs w:val="19"/>
+              </w:rPr>
+              <w:t xml:space="preserve">Unit, Integration</w:t>
+            </w:r>
+          </w:p>
+        </w:tc>
+      </w:tr>
+      <w:tr>
+        <w:tc>
+          <w:tcPr>
+            <w:tcW w:type="dxa" w:w="2600"/>
+            <w:tcBorders>
+              <w:top w:val="single" w:color="999999" w:sz="4"/>
+              <w:left w:val="single" w:color="999999" w:sz="4"/>
+              <w:bottom w:val="single" w:color="999999" w:sz="4"/>
+              <w:right w:val="single" w:color="999999" w:sz="4"/>
+            </w:tcBorders>
+            <w:tcMar>
+              <w:top w:type="dxa" w:w="60"/>
+              <w:left w:type="dxa" w:w="80"/>
+              <w:bottom w:type="dxa" w:w="60"/>
+              <w:right w:type="dxa" w:w="80"/>
+            </w:tcMar>
+            <w:vAlign w:val="center"/>
+          </w:tcPr>
+          <w:p>
+            <w:r>
+              <w:rPr>
+                <w:sz w:val="19"/>
+                <w:szCs w:val="19"/>
+              </w:rPr>
+              <w:t xml:space="preserve">SEBM-F-021</w:t>
+            </w:r>
+          </w:p>
+        </w:tc>
+        <w:tc>
+          <w:tcPr>
+            <w:tcW w:type="dxa" w:w="3000"/>
+            <w:tcBorders>
+              <w:top w:val="single" w:color="999999" w:sz="4"/>
+              <w:left w:val="single" w:color="999999" w:sz="4"/>
+              <w:bottom w:val="single" w:color="999999" w:sz="4"/>
+              <w:right w:val="single" w:color="999999" w:sz="4"/>
+            </w:tcBorders>
+            <w:tcMar>
+              <w:top w:type="dxa" w:w="60"/>
+              <w:left w:type="dxa" w:w="80"/>
+              <w:bottom w:type="dxa" w:w="60"/>
+              <w:right w:type="dxa" w:w="80"/>
+            </w:tcMar>
+            <w:vAlign w:val="center"/>
+          </w:tcPr>
+          <w:p>
+            <w:r>
+              <w:rPr>
+                <w:sz w:val="19"/>
+                <w:szCs w:val="19"/>
+              </w:rPr>
+              <w:t xml:space="preserve">TC-Bud-02</w:t>
+            </w:r>
+          </w:p>
+        </w:tc>
+        <w:tc>
+          <w:tcPr>
+            <w:tcW w:type="dxa" w:w="4628"/>
+            <w:tcBorders>
+              <w:top w:val="single" w:color="999999" w:sz="4"/>
+              <w:left w:val="single" w:color="999999" w:sz="4"/>
+              <w:bottom w:val="single" w:color="999999" w:sz="4"/>
+              <w:right w:val="single" w:color="999999" w:sz="4"/>
+            </w:tcBorders>
+            <w:tcMar>
+              <w:top w:type="dxa" w:w="60"/>
+              <w:left w:type="dxa" w:w="80"/>
+              <w:bottom w:type="dxa" w:w="60"/>
+              <w:right w:type="dxa" w:w="80"/>
+            </w:tcMar>
+            <w:vAlign w:val="center"/>
+          </w:tcPr>
+          <w:p>
+            <w:r>
+              <w:rPr>
+                <w:sz w:val="19"/>
+                <w:szCs w:val="19"/>
+              </w:rPr>
+              <w:t xml:space="preserve">Integration</w:t>
+            </w:r>
+          </w:p>
+        </w:tc>
+      </w:tr>
+      <w:tr>
+        <w:tc>
+          <w:tcPr>
+            <w:tcW w:type="dxa" w:w="2600"/>
+            <w:tcBorders>
+              <w:top w:val="single" w:color="999999" w:sz="4"/>
+              <w:left w:val="single" w:color="999999" w:sz="4"/>
+              <w:bottom w:val="single" w:color="999999" w:sz="4"/>
+              <w:right w:val="single" w:color="999999" w:sz="4"/>
+            </w:tcBorders>
+            <w:shd w:fill="F2F2F2" w:val="clear"/>
+            <w:tcMar>
+              <w:top w:type="dxa" w:w="60"/>
+              <w:left w:type="dxa" w:w="80"/>
+              <w:bottom w:type="dxa" w:w="60"/>
+              <w:right w:type="dxa" w:w="80"/>
+            </w:tcMar>
+            <w:vAlign w:val="center"/>
+          </w:tcPr>
+          <w:p>
+            <w:r>
+              <w:rPr>
+                <w:sz w:val="19"/>
+                <w:szCs w:val="19"/>
+              </w:rPr>
+              <w:t xml:space="preserve">SEBM-F-022</w:t>
+            </w:r>
+          </w:p>
+        </w:tc>
+        <w:tc>
+          <w:tcPr>
+            <w:tcW w:type="dxa" w:w="3000"/>
+            <w:tcBorders>
+              <w:top w:val="single" w:color="999999" w:sz="4"/>
+              <w:left w:val="single" w:color="999999" w:sz="4"/>
+              <w:bottom w:val="single" w:color="999999" w:sz="4"/>
+              <w:right w:val="single" w:color="999999" w:sz="4"/>
+            </w:tcBorders>
+            <w:shd w:fill="F2F2F2" w:val="clear"/>
+            <w:tcMar>
+              <w:top w:type="dxa" w:w="60"/>
+              <w:left w:type="dxa" w:w="80"/>
+              <w:bottom w:type="dxa" w:w="60"/>
+              <w:right w:type="dxa" w:w="80"/>
+            </w:tcMar>
+            <w:vAlign w:val="center"/>
+          </w:tcPr>
+          <w:p>
+            <w:r>
+              <w:rPr>
+                <w:sz w:val="19"/>
+                <w:szCs w:val="19"/>
+              </w:rPr>
+              <w:t xml:space="preserve">TC-Bud-03</w:t>
+            </w:r>
+          </w:p>
+        </w:tc>
+        <w:tc>
+          <w:tcPr>
+            <w:tcW w:type="dxa" w:w="4628"/>
+            <w:tcBorders>
+              <w:top w:val="single" w:color="999999" w:sz="4"/>
+              <w:left w:val="single" w:color="999999" w:sz="4"/>
+              <w:bottom w:val="single" w:color="999999" w:sz="4"/>
+              <w:right w:val="single" w:color="999999" w:sz="4"/>
+            </w:tcBorders>
+            <w:shd w:fill="F2F2F2" w:val="clear"/>
+            <w:tcMar>
+              <w:top w:type="dxa" w:w="60"/>
+              <w:left w:type="dxa" w:w="80"/>
+              <w:bottom w:type="dxa" w:w="60"/>
+              <w:right w:type="dxa" w:w="80"/>
+            </w:tcMar>
+            <w:vAlign w:val="center"/>
+          </w:tcPr>
+          <w:p>
+            <w:r>
+              <w:rPr>
+                <w:sz w:val="19"/>
+                <w:szCs w:val="19"/>
+              </w:rPr>
+              <w:t xml:space="preserve">Unit, Integration</w:t>
+            </w:r>
+          </w:p>
+        </w:tc>
+      </w:tr>
+      <w:tr>
+        <w:tc>
+          <w:tcPr>
+            <w:tcW w:type="dxa" w:w="2600"/>
+            <w:tcBorders>
+              <w:top w:val="single" w:color="999999" w:sz="4"/>
+              <w:left w:val="single" w:color="999999" w:sz="4"/>
+              <w:bottom w:val="single" w:color="999999" w:sz="4"/>
+              <w:right w:val="single" w:color="999999" w:sz="4"/>
+            </w:tcBorders>
+            <w:tcMar>
+              <w:top w:type="dxa" w:w="60"/>
+              <w:left w:type="dxa" w:w="80"/>
+              <w:bottom w:type="dxa" w:w="60"/>
+              <w:right w:type="dxa" w:w="80"/>
+            </w:tcMar>
+            <w:vAlign w:val="center"/>
+          </w:tcPr>
+          <w:p>
+            <w:r>
+              <w:rPr>
+                <w:sz w:val="19"/>
+                <w:szCs w:val="19"/>
+              </w:rPr>
+              <w:t xml:space="preserve">SEBM-F-030</w:t>
+            </w:r>
+          </w:p>
+        </w:tc>
+        <w:tc>
+          <w:tcPr>
+            <w:tcW w:type="dxa" w:w="3000"/>
+            <w:tcBorders>
+              <w:top w:val="single" w:color="999999" w:sz="4"/>
+              <w:left w:val="single" w:color="999999" w:sz="4"/>
+              <w:bottom w:val="single" w:color="999999" w:sz="4"/>
+              <w:right w:val="single" w:color="999999" w:sz="4"/>
+            </w:tcBorders>
+            <w:tcMar>
+              <w:top w:type="dxa" w:w="60"/>
+              <w:left w:type="dxa" w:w="80"/>
+              <w:bottom w:type="dxa" w:w="60"/>
+              <w:right w:type="dxa" w:w="80"/>
+            </w:tcMar>
+            <w:vAlign w:val="center"/>
+          </w:tcPr>
+          <w:p>
+            <w:r>
+              <w:rPr>
+                <w:sz w:val="19"/>
+                <w:szCs w:val="19"/>
+              </w:rPr>
+              <w:t xml:space="preserve">TC-Acc-01</w:t>
+            </w:r>
+          </w:p>
+        </w:tc>
+        <w:tc>
+          <w:tcPr>
+            <w:tcW w:type="dxa" w:w="4628"/>
+            <w:tcBorders>
+              <w:top w:val="single" w:color="999999" w:sz="4"/>
+              <w:left w:val="single" w:color="999999" w:sz="4"/>
+              <w:bottom w:val="single" w:color="999999" w:sz="4"/>
+              <w:right w:val="single" w:color="999999" w:sz="4"/>
+            </w:tcBorders>
+            <w:tcMar>
+              <w:top w:type="dxa" w:w="60"/>
+              <w:left w:type="dxa" w:w="80"/>
+              <w:bottom w:type="dxa" w:w="60"/>
+              <w:right w:type="dxa" w:w="80"/>
+            </w:tcMar>
+            <w:vAlign w:val="center"/>
+          </w:tcPr>
+          <w:p>
+            <w:r>
+              <w:rPr>
+                <w:sz w:val="19"/>
+                <w:szCs w:val="19"/>
+              </w:rPr>
+              <w:t xml:space="preserve">Unit, Integration</w:t>
+            </w:r>
+          </w:p>
+        </w:tc>
+      </w:tr>
+      <w:tr>
+        <w:tc>
+          <w:tcPr>
+            <w:tcW w:type="dxa" w:w="2600"/>
+            <w:tcBorders>
+              <w:top w:val="single" w:color="999999" w:sz="4"/>
+              <w:left w:val="single" w:color="999999" w:sz="4"/>
+              <w:bottom w:val="single" w:color="999999" w:sz="4"/>
+              <w:right w:val="single" w:color="999999" w:sz="4"/>
+            </w:tcBorders>
+            <w:shd w:fill="F2F2F2" w:val="clear"/>
+            <w:tcMar>
+              <w:top w:type="dxa" w:w="60"/>
+              <w:left w:type="dxa" w:w="80"/>
+              <w:bottom w:type="dxa" w:w="60"/>
+              <w:right w:type="dxa" w:w="80"/>
+            </w:tcMar>
+            <w:vAlign w:val="center"/>
+          </w:tcPr>
+          <w:p>
+            <w:r>
+              <w:rPr>
+                <w:sz w:val="19"/>
+                <w:szCs w:val="19"/>
+              </w:rPr>
+              <w:t xml:space="preserve">SEBM-F-031</w:t>
+            </w:r>
+          </w:p>
+        </w:tc>
+        <w:tc>
+          <w:tcPr>
+            <w:tcW w:type="dxa" w:w="3000"/>
+            <w:tcBorders>
+              <w:top w:val="single" w:color="999999" w:sz="4"/>
+              <w:left w:val="single" w:color="999999" w:sz="4"/>
+              <w:bottom w:val="single" w:color="999999" w:sz="4"/>
+              <w:right w:val="single" w:color="999999" w:sz="4"/>
+            </w:tcBorders>
+            <w:shd w:fill="F2F2F2" w:val="clear"/>
+            <w:tcMar>
+              <w:top w:type="dxa" w:w="60"/>
+              <w:left w:type="dxa" w:w="80"/>
+              <w:bottom w:type="dxa" w:w="60"/>
+              <w:right w:type="dxa" w:w="80"/>
+            </w:tcMar>
+            <w:vAlign w:val="center"/>
+          </w:tcPr>
+          <w:p>
+            <w:r>
+              <w:rPr>
+                <w:sz w:val="19"/>
+                <w:szCs w:val="19"/>
+              </w:rPr>
+              <w:t xml:space="preserve">TC-Acc-02</w:t>
+            </w:r>
+          </w:p>
+        </w:tc>
+        <w:tc>
+          <w:tcPr>
+            <w:tcW w:type="dxa" w:w="4628"/>
+            <w:tcBorders>
+              <w:top w:val="single" w:color="999999" w:sz="4"/>
+              <w:left w:val="single" w:color="999999" w:sz="4"/>
+              <w:bottom w:val="single" w:color="999999" w:sz="4"/>
+              <w:right w:val="single" w:color="999999" w:sz="4"/>
+            </w:tcBorders>
+            <w:shd w:fill="F2F2F2" w:val="clear"/>
+            <w:tcMar>
+              <w:top w:type="dxa" w:w="60"/>
+              <w:left w:type="dxa" w:w="80"/>
+              <w:bottom w:type="dxa" w:w="60"/>
+              <w:right w:type="dxa" w:w="80"/>
+            </w:tcMar>
+            <w:vAlign w:val="center"/>
+          </w:tcPr>
+          <w:p>
+            <w:r>
+              <w:rPr>
+                <w:sz w:val="19"/>
+                <w:szCs w:val="19"/>
+              </w:rPr>
+              <w:t xml:space="preserve">Unit, Integration</w:t>
+            </w:r>
+          </w:p>
+        </w:tc>
+      </w:tr>
+      <w:tr>
+        <w:tc>
+          <w:tcPr>
+            <w:tcW w:type="dxa" w:w="2600"/>
+            <w:tcBorders>
+              <w:top w:val="single" w:color="999999" w:sz="4"/>
+              <w:left w:val="single" w:color="999999" w:sz="4"/>
+              <w:bottom w:val="single" w:color="999999" w:sz="4"/>
+              <w:right w:val="single" w:color="999999" w:sz="4"/>
+            </w:tcBorders>
+            <w:tcMar>
+              <w:top w:type="dxa" w:w="60"/>
+              <w:left w:type="dxa" w:w="80"/>
+              <w:bottom w:type="dxa" w:w="60"/>
+              <w:right w:type="dxa" w:w="80"/>
+            </w:tcMar>
+            <w:vAlign w:val="center"/>
+          </w:tcPr>
+          <w:p>
+            <w:r>
+              <w:rPr>
+                <w:sz w:val="19"/>
+                <w:szCs w:val="19"/>
+              </w:rPr>
+              <w:t xml:space="preserve">SEBM-F-040</w:t>
+            </w:r>
+          </w:p>
+        </w:tc>
+        <w:tc>
+          <w:tcPr>
+            <w:tcW w:type="dxa" w:w="3000"/>
+            <w:tcBorders>
+              <w:top w:val="single" w:color="999999" w:sz="4"/>
+              <w:left w:val="single" w:color="999999" w:sz="4"/>
+              <w:bottom w:val="single" w:color="999999" w:sz="4"/>
+              <w:right w:val="single" w:color="999999" w:sz="4"/>
+            </w:tcBorders>
+            <w:tcMar>
+              <w:top w:type="dxa" w:w="60"/>
+              <w:left w:type="dxa" w:w="80"/>
+              <w:bottom w:type="dxa" w:w="60"/>
+              <w:right w:type="dxa" w:w="80"/>
+            </w:tcMar>
+            <w:vAlign w:val="center"/>
+          </w:tcPr>
+          <w:p>
+            <w:r>
+              <w:rPr>
+                <w:sz w:val="19"/>
+                <w:szCs w:val="19"/>
+              </w:rPr>
+              <w:t xml:space="preserve">TC-Rep-01</w:t>
+            </w:r>
+          </w:p>
+        </w:tc>
+        <w:tc>
+          <w:tcPr>
+            <w:tcW w:type="dxa" w:w="4628"/>
+            <w:tcBorders>
+              <w:top w:val="single" w:color="999999" w:sz="4"/>
+              <w:left w:val="single" w:color="999999" w:sz="4"/>
+              <w:bottom w:val="single" w:color="999999" w:sz="4"/>
+              <w:right w:val="single" w:color="999999" w:sz="4"/>
+            </w:tcBorders>
+            <w:tcMar>
+              <w:top w:type="dxa" w:w="60"/>
+              <w:left w:type="dxa" w:w="80"/>
+              <w:bottom w:type="dxa" w:w="60"/>
+              <w:right w:type="dxa" w:w="80"/>
+            </w:tcMar>
+            <w:vAlign w:val="center"/>
+          </w:tcPr>
+          <w:p>
+            <w:r>
+              <w:rPr>
+                <w:sz w:val="19"/>
+                <w:szCs w:val="19"/>
+              </w:rPr>
+              <w:t xml:space="preserve">Unit, Integration</w:t>
+            </w:r>
+          </w:p>
+        </w:tc>
+      </w:tr>
+      <w:tr>
+        <w:tc>
+          <w:tcPr>
+            <w:tcW w:type="dxa" w:w="2600"/>
+            <w:tcBorders>
+              <w:top w:val="single" w:color="999999" w:sz="4"/>
+              <w:left w:val="single" w:color="999999" w:sz="4"/>
+              <w:bottom w:val="single" w:color="999999" w:sz="4"/>
+              <w:right w:val="single" w:color="999999" w:sz="4"/>
+            </w:tcBorders>
+            <w:shd w:fill="F2F2F2" w:val="clear"/>
+            <w:tcMar>
+              <w:top w:type="dxa" w:w="60"/>
+              <w:left w:type="dxa" w:w="80"/>
+              <w:bottom w:type="dxa" w:w="60"/>
+              <w:right w:type="dxa" w:w="80"/>
+            </w:tcMar>
+            <w:vAlign w:val="center"/>
+          </w:tcPr>
+          <w:p>
+            <w:r>
+              <w:rPr>
+                <w:sz w:val="19"/>
+                <w:szCs w:val="19"/>
+              </w:rPr>
+              <w:t xml:space="preserve">SEBM-F-041</w:t>
+            </w:r>
+          </w:p>
+        </w:tc>
+        <w:tc>
+          <w:tcPr>
+            <w:tcW w:type="dxa" w:w="3000"/>
+            <w:tcBorders>
+              <w:top w:val="single" w:color="999999" w:sz="4"/>
+              <w:left w:val="single" w:color="999999" w:sz="4"/>
+              <w:bottom w:val="single" w:color="999999" w:sz="4"/>
+              <w:right w:val="single" w:color="999999" w:sz="4"/>
+            </w:tcBorders>
+            <w:shd w:fill="F2F2F2" w:val="clear"/>
+            <w:tcMar>
+              <w:top w:type="dxa" w:w="60"/>
+              <w:left w:type="dxa" w:w="80"/>
+              <w:bottom w:type="dxa" w:w="60"/>
+              <w:right w:type="dxa" w:w="80"/>
+            </w:tcMar>
+            <w:vAlign w:val="center"/>
+          </w:tcPr>
+          <w:p>
+            <w:r>
+              <w:rPr>
+                <w:sz w:val="19"/>
+                <w:szCs w:val="19"/>
+              </w:rPr>
+              <w:t xml:space="preserve">TC-Rep-02</w:t>
+            </w:r>
+          </w:p>
+        </w:tc>
+        <w:tc>
+          <w:tcPr>
+            <w:tcW w:type="dxa" w:w="4628"/>
+            <w:tcBorders>
+              <w:top w:val="single" w:color="999999" w:sz="4"/>
+              <w:left w:val="single" w:color="999999" w:sz="4"/>
+              <w:bottom w:val="single" w:color="999999" w:sz="4"/>
+              <w:right w:val="single" w:color="999999" w:sz="4"/>
+            </w:tcBorders>
+            <w:shd w:fill="F2F2F2" w:val="clear"/>
+            <w:tcMar>
+              <w:top w:type="dxa" w:w="60"/>
+              <w:left w:type="dxa" w:w="80"/>
+              <w:bottom w:type="dxa" w:w="60"/>
+              <w:right w:type="dxa" w:w="80"/>
+            </w:tcMar>
+            <w:vAlign w:val="center"/>
+          </w:tcPr>
+          <w:p>
+            <w:r>
+              <w:rPr>
+                <w:sz w:val="19"/>
+                <w:szCs w:val="19"/>
+              </w:rPr>
+              <w:t xml:space="preserve">Integration</w:t>
+            </w:r>
+          </w:p>
+        </w:tc>
+      </w:tr>
+      <w:tr>
+        <w:tc>
+          <w:tcPr>
+            <w:tcW w:type="dxa" w:w="2600"/>
+            <w:tcBorders>
+              <w:top w:val="single" w:color="999999" w:sz="4"/>
+              <w:left w:val="single" w:color="999999" w:sz="4"/>
+              <w:bottom w:val="single" w:color="999999" w:sz="4"/>
+              <w:right w:val="single" w:color="999999" w:sz="4"/>
+            </w:tcBorders>
+            <w:tcMar>
+              <w:top w:type="dxa" w:w="60"/>
+              <w:left w:type="dxa" w:w="80"/>
+              <w:bottom w:type="dxa" w:w="60"/>
+              <w:right w:type="dxa" w:w="80"/>
+            </w:tcMar>
+            <w:vAlign w:val="center"/>
+          </w:tcPr>
+          <w:p>
+            <w:r>
+              <w:rPr>
+                <w:sz w:val="19"/>
+                <w:szCs w:val="19"/>
+              </w:rPr>
+              <w:t xml:space="preserve">SEBM-F-042</w:t>
+            </w:r>
+          </w:p>
+        </w:tc>
+        <w:tc>
+          <w:tcPr>
+            <w:tcW w:type="dxa" w:w="3000"/>
+            <w:tcBorders>
+              <w:top w:val="single" w:color="999999" w:sz="4"/>
+              <w:left w:val="single" w:color="999999" w:sz="4"/>
+              <w:bottom w:val="single" w:color="999999" w:sz="4"/>
+              <w:right w:val="single" w:color="999999" w:sz="4"/>
+            </w:tcBorders>
+            <w:tcMar>
+              <w:top w:type="dxa" w:w="60"/>
+              <w:left w:type="dxa" w:w="80"/>
+              <w:bottom w:type="dxa" w:w="60"/>
+              <w:right w:type="dxa" w:w="80"/>
+            </w:tcMar>
+            <w:vAlign w:val="center"/>
+          </w:tcPr>
+          <w:p>
+            <w:r>
+              <w:rPr>
+                <w:sz w:val="19"/>
+                <w:szCs w:val="19"/>
+              </w:rPr>
+              <w:t xml:space="preserve">TC-Rep-03</w:t>
+            </w:r>
+          </w:p>
+        </w:tc>
+        <w:tc>
+          <w:tcPr>
+            <w:tcW w:type="dxa" w:w="4628"/>
+            <w:tcBorders>
+              <w:top w:val="single" w:color="999999" w:sz="4"/>
+              <w:left w:val="single" w:color="999999" w:sz="4"/>
+              <w:bottom w:val="single" w:color="999999" w:sz="4"/>
+              <w:right w:val="single" w:color="999999" w:sz="4"/>
+            </w:tcBorders>
+            <w:tcMar>
+              <w:top w:type="dxa" w:w="60"/>
+              <w:left w:type="dxa" w:w="80"/>
+              <w:bottom w:type="dxa" w:w="60"/>
+              <w:right w:type="dxa" w:w="80"/>
+            </w:tcMar>
+            <w:vAlign w:val="center"/>
+          </w:tcPr>
+          <w:p>
+            <w:r>
+              <w:rPr>
+                <w:sz w:val="19"/>
+                <w:szCs w:val="19"/>
+              </w:rPr>
+              <w:t xml:space="preserve">Unit</w:t>
+            </w:r>
+          </w:p>
+        </w:tc>
+      </w:tr>
+      <w:tr>
+        <w:tc>
+          <w:tcPr>
+            <w:tcW w:type="dxa" w:w="2600"/>
+            <w:tcBorders>
+              <w:top w:val="single" w:color="999999" w:sz="4"/>
+              <w:left w:val="single" w:color="999999" w:sz="4"/>
+              <w:bottom w:val="single" w:color="999999" w:sz="4"/>
+              <w:right w:val="single" w:color="999999" w:sz="4"/>
+            </w:tcBorders>
+            <w:shd w:fill="F2F2F2" w:val="clear"/>
+            <w:tcMar>
+              <w:top w:type="dxa" w:w="60"/>
+              <w:left w:type="dxa" w:w="80"/>
+              <w:bottom w:type="dxa" w:w="60"/>
+              <w:right w:type="dxa" w:w="80"/>
+            </w:tcMar>
+            <w:vAlign w:val="center"/>
+          </w:tcPr>
+          <w:p>
+            <w:r>
+              <w:rPr>
+                <w:sz w:val="19"/>
+                <w:szCs w:val="19"/>
+              </w:rPr>
+              <w:t xml:space="preserve">SEBM-F-050</w:t>
+            </w:r>
+          </w:p>
+        </w:tc>
+        <w:tc>
+          <w:tcPr>
+            <w:tcW w:type="dxa" w:w="3000"/>
+            <w:tcBorders>
+              <w:top w:val="single" w:color="999999" w:sz="4"/>
+              <w:left w:val="single" w:color="999999" w:sz="4"/>
+              <w:bottom w:val="single" w:color="999999" w:sz="4"/>
+              <w:right w:val="single" w:color="999999" w:sz="4"/>
+            </w:tcBorders>
+            <w:shd w:fill="F2F2F2" w:val="clear"/>
+            <w:tcMar>
+              <w:top w:type="dxa" w:w="60"/>
+              <w:left w:type="dxa" w:w="80"/>
+              <w:bottom w:type="dxa" w:w="60"/>
+              <w:right w:type="dxa" w:w="80"/>
+            </w:tcMar>
+            <w:vAlign w:val="center"/>
+          </w:tcPr>
+          <w:p>
+            <w:r>
+              <w:rPr>
+                <w:sz w:val="19"/>
+                <w:szCs w:val="19"/>
+              </w:rPr>
+              <w:t xml:space="preserve">TC-Notif-01</w:t>
+            </w:r>
+          </w:p>
+        </w:tc>
+        <w:tc>
+          <w:tcPr>
+            <w:tcW w:type="dxa" w:w="4628"/>
+            <w:tcBorders>
+              <w:top w:val="single" w:color="999999" w:sz="4"/>
+              <w:left w:val="single" w:color="999999" w:sz="4"/>
+              <w:bottom w:val="single" w:color="999999" w:sz="4"/>
+              <w:right w:val="single" w:color="999999" w:sz="4"/>
+            </w:tcBorders>
+            <w:shd w:fill="F2F2F2" w:val="clear"/>
+            <w:tcMar>
+              <w:top w:type="dxa" w:w="60"/>
+              <w:left w:type="dxa" w:w="80"/>
+              <w:bottom w:type="dxa" w:w="60"/>
+              <w:right w:type="dxa" w:w="80"/>
+            </w:tcMar>
+            <w:vAlign w:val="center"/>
+          </w:tcPr>
+          <w:p>
+            <w:r>
+              <w:rPr>
+                <w:sz w:val="19"/>
+                <w:szCs w:val="19"/>
+              </w:rPr>
+              <w:t xml:space="preserve">Integration</w:t>
+            </w:r>
+          </w:p>
+        </w:tc>
+      </w:tr>
+      <w:tr>
+        <w:tc>
+          <w:tcPr>
+            <w:tcW w:type="dxa" w:w="2600"/>
+            <w:tcBorders>
+              <w:top w:val="single" w:color="999999" w:sz="4"/>
+              <w:left w:val="single" w:color="999999" w:sz="4"/>
+              <w:bottom w:val="single" w:color="999999" w:sz="4"/>
+              <w:right w:val="single" w:color="999999" w:sz="4"/>
+            </w:tcBorders>
+            <w:tcMar>
+              <w:top w:type="dxa" w:w="60"/>
+              <w:left w:type="dxa" w:w="80"/>
+              <w:bottom w:type="dxa" w:w="60"/>
+              <w:right w:type="dxa" w:w="80"/>
+            </w:tcMar>
+            <w:vAlign w:val="center"/>
+          </w:tcPr>
+          <w:p>
+            <w:r>
+              <w:rPr>
+                <w:sz w:val="19"/>
+                <w:szCs w:val="19"/>
+              </w:rPr>
+              <w:t xml:space="preserve">SEBM-F-051</w:t>
+            </w:r>
+          </w:p>
+        </w:tc>
+        <w:tc>
+          <w:tcPr>
+            <w:tcW w:type="dxa" w:w="3000"/>
+            <w:tcBorders>
+              <w:top w:val="single" w:color="999999" w:sz="4"/>
+              <w:left w:val="single" w:color="999999" w:sz="4"/>
+              <w:bottom w:val="single" w:color="999999" w:sz="4"/>
+              <w:right w:val="single" w:color="999999" w:sz="4"/>
+            </w:tcBorders>
+            <w:tcMar>
+              <w:top w:type="dxa" w:w="60"/>
+              <w:left w:type="dxa" w:w="80"/>
+              <w:bottom w:type="dxa" w:w="60"/>
+              <w:right w:type="dxa" w:w="80"/>
+            </w:tcMar>
+            <w:vAlign w:val="center"/>
+          </w:tcPr>
+          <w:p>
+            <w:r>
+              <w:rPr>
+                <w:sz w:val="19"/>
+                <w:szCs w:val="19"/>
+              </w:rPr>
+              <w:t xml:space="preserve">TC-Notif-02</w:t>
+            </w:r>
+          </w:p>
+        </w:tc>
+        <w:tc>
+          <w:tcPr>
+            <w:tcW w:type="dxa" w:w="4628"/>
+            <w:tcBorders>
+              <w:top w:val="single" w:color="999999" w:sz="4"/>
+              <w:left w:val="single" w:color="999999" w:sz="4"/>
+              <w:bottom w:val="single" w:color="999999" w:sz="4"/>
+              <w:right w:val="single" w:color="999999" w:sz="4"/>
+            </w:tcBorders>
+            <w:tcMar>
+              <w:top w:type="dxa" w:w="60"/>
+              <w:left w:type="dxa" w:w="80"/>
+              <w:bottom w:type="dxa" w:w="60"/>
+              <w:right w:type="dxa" w:w="80"/>
+            </w:tcMar>
+            <w:vAlign w:val="center"/>
+          </w:tcPr>
+          <w:p>
+            <w:r>
+              <w:rPr>
+                <w:sz w:val="19"/>
+                <w:szCs w:val="19"/>
+              </w:rPr>
+              <w:t xml:space="preserve">Integration</w:t>
+            </w:r>
+          </w:p>
+        </w:tc>
+      </w:tr>
+      <w:tr>
+        <w:tc>
+          <w:tcPr>
+            <w:tcW w:type="dxa" w:w="2600"/>
+            <w:tcBorders>
+              <w:top w:val="single" w:color="999999" w:sz="4"/>
+              <w:left w:val="single" w:color="999999" w:sz="4"/>
+              <w:bottom w:val="single" w:color="999999" w:sz="4"/>
+              <w:right w:val="single" w:color="999999" w:sz="4"/>
+            </w:tcBorders>
+            <w:shd w:fill="F2F2F2" w:val="clear"/>
+            <w:tcMar>
+              <w:top w:type="dxa" w:w="60"/>
+              <w:left w:type="dxa" w:w="80"/>
+              <w:bottom w:type="dxa" w:w="60"/>
+              <w:right w:type="dxa" w:w="80"/>
+            </w:tcMar>
+            <w:vAlign w:val="center"/>
+          </w:tcPr>
+          <w:p>
+            <w:r>
+              <w:rPr>
+                <w:sz w:val="19"/>
+                <w:szCs w:val="19"/>
+              </w:rPr>
+              <w:t xml:space="preserve">SEBM-NF-001</w:t>
+            </w:r>
+          </w:p>
+        </w:tc>
+        <w:tc>
+          <w:tcPr>
+            <w:tcW w:type="dxa" w:w="3000"/>
+            <w:tcBorders>
+              <w:top w:val="single" w:color="999999" w:sz="4"/>
+              <w:left w:val="single" w:color="999999" w:sz="4"/>
+              <w:bottom w:val="single" w:color="999999" w:sz="4"/>
+              <w:right w:val="single" w:color="999999" w:sz="4"/>
+            </w:tcBorders>
+            <w:shd w:fill="F2F2F2" w:val="clear"/>
+            <w:tcMar>
+              <w:top w:type="dxa" w:w="60"/>
+              <w:left w:type="dxa" w:w="80"/>
+              <w:bottom w:type="dxa" w:w="60"/>
+              <w:right w:type="dxa" w:w="80"/>
+            </w:tcMar>
+            <w:vAlign w:val="center"/>
+          </w:tcPr>
+          <w:p>
+            <w:r>
+              <w:rPr>
+                <w:sz w:val="19"/>
+                <w:szCs w:val="19"/>
+              </w:rPr>
+              <w:t xml:space="preserve">TC-Perf-01</w:t>
+            </w:r>
+          </w:p>
+        </w:tc>
+        <w:tc>
+          <w:tcPr>
+            <w:tcW w:type="dxa" w:w="4628"/>
+            <w:tcBorders>
+              <w:top w:val="single" w:color="999999" w:sz="4"/>
+              <w:left w:val="single" w:color="999999" w:sz="4"/>
+              <w:bottom w:val="single" w:color="999999" w:sz="4"/>
+              <w:right w:val="single" w:color="999999" w:sz="4"/>
+            </w:tcBorders>
+            <w:shd w:fill="F2F2F2" w:val="clear"/>
+            <w:tcMar>
+              <w:top w:type="dxa" w:w="60"/>
+              <w:left w:type="dxa" w:w="80"/>
+              <w:bottom w:type="dxa" w:w="60"/>
+              <w:right w:type="dxa" w:w="80"/>
+            </w:tcMar>
+            <w:vAlign w:val="center"/>
+          </w:tcPr>
+          <w:p>
+            <w:r>
+              <w:rPr>
+                <w:sz w:val="19"/>
+                <w:szCs w:val="19"/>
+              </w:rPr>
+              <w:t xml:space="preserve">Performance</w:t>
+            </w:r>
+          </w:p>
+        </w:tc>
+      </w:tr>
+      <w:tr>
+        <w:tc>
+          <w:tcPr>
+            <w:tcW w:type="dxa" w:w="2600"/>
+            <w:tcBorders>
+              <w:top w:val="single" w:color="999999" w:sz="4"/>
+              <w:left w:val="single" w:color="999999" w:sz="4"/>
+              <w:bottom w:val="single" w:color="999999" w:sz="4"/>
+              <w:right w:val="single" w:color="999999" w:sz="4"/>
+            </w:tcBorders>
+            <w:tcMar>
+              <w:top w:type="dxa" w:w="60"/>
+              <w:left w:type="dxa" w:w="80"/>
+              <w:bottom w:type="dxa" w:w="60"/>
+              <w:right w:type="dxa" w:w="80"/>
+            </w:tcMar>
+            <w:vAlign w:val="center"/>
+          </w:tcPr>
+          <w:p>
+            <w:r>
+              <w:rPr>
+                <w:sz w:val="19"/>
+                <w:szCs w:val="19"/>
+              </w:rPr>
+              <w:t xml:space="preserve">SEBM-NF-002</w:t>
+            </w:r>
+          </w:p>
+        </w:tc>
+        <w:tc>
+          <w:tcPr>
+            <w:tcW w:type="dxa" w:w="3000"/>
+            <w:tcBorders>
+              <w:top w:val="single" w:color="999999" w:sz="4"/>
+              <w:left w:val="single" w:color="999999" w:sz="4"/>
+              <w:bottom w:val="single" w:color="999999" w:sz="4"/>
+              <w:right w:val="single" w:color="999999" w:sz="4"/>
+            </w:tcBorders>
+            <w:tcMar>
+              <w:top w:type="dxa" w:w="60"/>
+              <w:left w:type="dxa" w:w="80"/>
+              <w:bottom w:type="dxa" w:w="60"/>
+              <w:right w:type="dxa" w:w="80"/>
+            </w:tcMar>
+            <w:vAlign w:val="center"/>
+          </w:tcPr>
+          <w:p>
+            <w:r>
+              <w:rPr>
+                <w:sz w:val="19"/>
+                <w:szCs w:val="19"/>
+              </w:rPr>
+              <w:t xml:space="preserve">Ops reports</w:t>
+            </w:r>
+          </w:p>
+        </w:tc>
+        <w:tc>
+          <w:tcPr>
+            <w:tcW w:type="dxa" w:w="4628"/>
+            <w:tcBorders>
+              <w:top w:val="single" w:color="999999" w:sz="4"/>
+              <w:left w:val="single" w:color="999999" w:sz="4"/>
+              <w:bottom w:val="single" w:color="999999" w:sz="4"/>
+              <w:right w:val="single" w:color="999999" w:sz="4"/>
+            </w:tcBorders>
+            <w:tcMar>
+              <w:top w:type="dxa" w:w="60"/>
+              <w:left w:type="dxa" w:w="80"/>
+              <w:bottom w:type="dxa" w:w="60"/>
+              <w:right w:type="dxa" w:w="80"/>
+            </w:tcMar>
+            <w:vAlign w:val="center"/>
+          </w:tcPr>
+          <w:p>
+            <w:r>
+              <w:rPr>
+                <w:sz w:val="19"/>
+                <w:szCs w:val="19"/>
+              </w:rPr>
+              <w:t xml:space="preserve">Operational monitoring</w:t>
+            </w:r>
+          </w:p>
+        </w:tc>
+      </w:tr>
+      <w:tr>
+        <w:tc>
+          <w:tcPr>
+            <w:tcW w:type="dxa" w:w="2600"/>
+            <w:tcBorders>
+              <w:top w:val="single" w:color="999999" w:sz="4"/>
+              <w:left w:val="single" w:color="999999" w:sz="4"/>
+              <w:bottom w:val="single" w:color="999999" w:sz="4"/>
+              <w:right w:val="single" w:color="999999" w:sz="4"/>
+            </w:tcBorders>
+            <w:shd w:fill="F2F2F2" w:val="clear"/>
+            <w:tcMar>
+              <w:top w:type="dxa" w:w="60"/>
+              <w:left w:type="dxa" w:w="80"/>
+              <w:bottom w:type="dxa" w:w="60"/>
+              <w:right w:type="dxa" w:w="80"/>
+            </w:tcMar>
+            <w:vAlign w:val="center"/>
+          </w:tcPr>
+          <w:p>
+            <w:r>
+              <w:rPr>
+                <w:sz w:val="19"/>
+                <w:szCs w:val="19"/>
+              </w:rPr>
+              <w:t xml:space="preserve">SEBM-NF-003</w:t>
+            </w:r>
+          </w:p>
+        </w:tc>
+        <w:tc>
+          <w:tcPr>
+            <w:tcW w:type="dxa" w:w="3000"/>
+            <w:tcBorders>
+              <w:top w:val="single" w:color="999999" w:sz="4"/>
+              <w:left w:val="single" w:color="999999" w:sz="4"/>
+              <w:bottom w:val="single" w:color="999999" w:sz="4"/>
+              <w:right w:val="single" w:color="999999" w:sz="4"/>
+            </w:tcBorders>
+            <w:shd w:fill="F2F2F2" w:val="clear"/>
+            <w:tcMar>
+              <w:top w:type="dxa" w:w="60"/>
+              <w:left w:type="dxa" w:w="80"/>
+              <w:bottom w:type="dxa" w:w="60"/>
+              <w:right w:type="dxa" w:w="80"/>
+            </w:tcMar>
+            <w:vAlign w:val="center"/>
+          </w:tcPr>
+          <w:p>
+            <w:r>
+              <w:rPr>
+                <w:sz w:val="19"/>
+                <w:szCs w:val="19"/>
+              </w:rPr>
+              <w:t xml:space="preserve">TC-Sec-01</w:t>
+            </w:r>
+          </w:p>
+        </w:tc>
+        <w:tc>
+          <w:tcPr>
+            <w:tcW w:type="dxa" w:w="4628"/>
+            <w:tcBorders>
+              <w:top w:val="single" w:color="999999" w:sz="4"/>
+              <w:left w:val="single" w:color="999999" w:sz="4"/>
+              <w:bottom w:val="single" w:color="999999" w:sz="4"/>
+              <w:right w:val="single" w:color="999999" w:sz="4"/>
+            </w:tcBorders>
+            <w:shd w:fill="F2F2F2" w:val="clear"/>
+            <w:tcMar>
+              <w:top w:type="dxa" w:w="60"/>
+              <w:left w:type="dxa" w:w="80"/>
+              <w:bottom w:type="dxa" w:w="60"/>
+              <w:right w:type="dxa" w:w="80"/>
+            </w:tcMar>
+            <w:vAlign w:val="center"/>
+          </w:tcPr>
+          <w:p>
+            <w:r>
+              <w:rPr>
+                <w:sz w:val="19"/>
+                <w:szCs w:val="19"/>
+              </w:rPr>
+              <w:t xml:space="preserve">Security</w:t>
+            </w:r>
+          </w:p>
+        </w:tc>
+      </w:tr>
+      <w:tr>
+        <w:tc>
+          <w:tcPr>
+            <w:tcW w:type="dxa" w:w="2600"/>
+            <w:tcBorders>
+              <w:top w:val="single" w:color="999999" w:sz="4"/>
+              <w:left w:val="single" w:color="999999" w:sz="4"/>
+              <w:bottom w:val="single" w:color="999999" w:sz="4"/>
+              <w:right w:val="single" w:color="999999" w:sz="4"/>
+            </w:tcBorders>
+            <w:tcMar>
+              <w:top w:type="dxa" w:w="60"/>
+              <w:left w:type="dxa" w:w="80"/>
+              <w:bottom w:type="dxa" w:w="60"/>
+              <w:right w:type="dxa" w:w="80"/>
+            </w:tcMar>
+            <w:vAlign w:val="center"/>
+          </w:tcPr>
+          <w:p>
+            <w:r>
+              <w:rPr>
+                <w:sz w:val="19"/>
+                <w:szCs w:val="19"/>
+              </w:rPr>
+              <w:t xml:space="preserve">SEBM-NF-004</w:t>
+            </w:r>
+          </w:p>
+        </w:tc>
+        <w:tc>
+          <w:tcPr>
+            <w:tcW w:type="dxa" w:w="3000"/>
+            <w:tcBorders>
+              <w:top w:val="single" w:color="999999" w:sz="4"/>
+              <w:left w:val="single" w:color="999999" w:sz="4"/>
+              <w:bottom w:val="single" w:color="999999" w:sz="4"/>
+              <w:right w:val="single" w:color="999999" w:sz="4"/>
+            </w:tcBorders>
+            <w:tcMar>
+              <w:top w:type="dxa" w:w="60"/>
+              <w:left w:type="dxa" w:w="80"/>
+              <w:bottom w:type="dxa" w:w="60"/>
+              <w:right w:type="dxa" w:w="80"/>
+            </w:tcMar>
+            <w:vAlign w:val="center"/>
+          </w:tcPr>
+          <w:p>
+            <w:r>
+              <w:rPr>
+                <w:sz w:val="19"/>
+                <w:szCs w:val="19"/>
+              </w:rPr>
+              <w:t xml:space="preserve">TC-UX-01</w:t>
+            </w:r>
+          </w:p>
+        </w:tc>
+        <w:tc>
+          <w:tcPr>
+            <w:tcW w:type="dxa" w:w="4628"/>
+            <w:tcBorders>
+              <w:top w:val="single" w:color="999999" w:sz="4"/>
+              <w:left w:val="single" w:color="999999" w:sz="4"/>
+              <w:bottom w:val="single" w:color="999999" w:sz="4"/>
+              <w:right w:val="single" w:color="999999" w:sz="4"/>
+            </w:tcBorders>
+            <w:tcMar>
+              <w:top w:type="dxa" w:w="60"/>
+              <w:left w:type="dxa" w:w="80"/>
+              <w:bottom w:type="dxa" w:w="60"/>
+              <w:right w:type="dxa" w:w="80"/>
+            </w:tcMar>
+            <w:vAlign w:val="center"/>
+          </w:tcPr>
+          <w:p>
+            <w:r>
+              <w:rPr>
+                <w:sz w:val="19"/>
+                <w:szCs w:val="19"/>
+              </w:rPr>
+              <w:t xml:space="preserve">Accessibility</w:t>
+            </w:r>
+          </w:p>
+        </w:tc>
+      </w:tr>
+      <w:tr>
+        <w:tc>
+          <w:tcPr>
+            <w:tcW w:type="dxa" w:w="2600"/>
+            <w:tcBorders>
+              <w:top w:val="single" w:color="999999" w:sz="4"/>
+              <w:left w:val="single" w:color="999999" w:sz="4"/>
+              <w:bottom w:val="single" w:color="999999" w:sz="4"/>
+              <w:right w:val="single" w:color="999999" w:sz="4"/>
+            </w:tcBorders>
+            <w:shd w:fill="F2F2F2" w:val="clear"/>
+            <w:tcMar>
+              <w:top w:type="dxa" w:w="60"/>
+              <w:left w:type="dxa" w:w="80"/>
+              <w:bottom w:type="dxa" w:w="60"/>
+              <w:right w:type="dxa" w:w="80"/>
+            </w:tcMar>
+            <w:vAlign w:val="center"/>
+          </w:tcPr>
+          <w:p>
+            <w:r>
+              <w:rPr>
+                <w:sz w:val="19"/>
+                <w:szCs w:val="19"/>
+              </w:rPr>
+              <w:t xml:space="preserve">SEBM-NF-005</w:t>
+            </w:r>
+          </w:p>
+        </w:tc>
+        <w:tc>
+          <w:tcPr>
+            <w:tcW w:type="dxa" w:w="3000"/>
+            <w:tcBorders>
+              <w:top w:val="single" w:color="999999" w:sz="4"/>
+              <w:left w:val="single" w:color="999999" w:sz="4"/>
+              <w:bottom w:val="single" w:color="999999" w:sz="4"/>
+              <w:right w:val="single" w:color="999999" w:sz="4"/>
+            </w:tcBorders>
+            <w:shd w:fill="F2F2F2" w:val="clear"/>
+            <w:tcMar>
+              <w:top w:type="dxa" w:w="60"/>
+              <w:left w:type="dxa" w:w="80"/>
+              <w:bottom w:type="dxa" w:w="60"/>
+              <w:right w:type="dxa" w:w="80"/>
+            </w:tcMar>
+            <w:vAlign w:val="center"/>
+          </w:tcPr>
+          <w:p>
+            <w:r>
+              <w:rPr>
+                <w:sz w:val="19"/>
+                <w:szCs w:val="19"/>
+              </w:rPr>
+              <w:t xml:space="preserve">TC-Scale-01</w:t>
+            </w:r>
+          </w:p>
+        </w:tc>
+        <w:tc>
+          <w:tcPr>
+            <w:tcW w:type="dxa" w:w="4628"/>
+            <w:tcBorders>
+              <w:top w:val="single" w:color="999999" w:sz="4"/>
+              <w:left w:val="single" w:color="999999" w:sz="4"/>
+              <w:bottom w:val="single" w:color="999999" w:sz="4"/>
+              <w:right w:val="single" w:color="999999" w:sz="4"/>
+            </w:tcBorders>
+            <w:shd w:fill="F2F2F2" w:val="clear"/>
+            <w:tcMar>
+              <w:top w:type="dxa" w:w="60"/>
+              <w:left w:type="dxa" w:w="80"/>
+              <w:bottom w:type="dxa" w:w="60"/>
+              <w:right w:type="dxa" w:w="80"/>
+            </w:tcMar>
+            <w:vAlign w:val="center"/>
+          </w:tcPr>
+          <w:p>
+            <w:r>
+              <w:rPr>
+                <w:sz w:val="19"/>
+                <w:szCs w:val="19"/>
+              </w:rPr>
+              <w:t xml:space="preserve">Performance</w:t>
+            </w:r>
+          </w:p>
+        </w:tc>
+      </w:tr>
+      <w:tr>
+        <w:tc>
+          <w:tcPr>
+            <w:tcW w:type="dxa" w:w="2600"/>
+            <w:tcBorders>
+              <w:top w:val="single" w:color="999999" w:sz="4"/>
+              <w:left w:val="single" w:color="999999" w:sz="4"/>
+              <w:bottom w:val="single" w:color="999999" w:sz="4"/>
+              <w:right w:val="single" w:color="999999" w:sz="4"/>
+            </w:tcBorders>
+            <w:tcMar>
+              <w:top w:type="dxa" w:w="60"/>
+              <w:left w:type="dxa" w:w="80"/>
+              <w:bottom w:type="dxa" w:w="60"/>
+              <w:right w:type="dxa" w:w="80"/>
+            </w:tcMar>
+            <w:vAlign w:val="center"/>
+          </w:tcPr>
+          <w:p>
+            <w:r>
+              <w:rPr>
+                <w:sz w:val="19"/>
+                <w:szCs w:val="19"/>
+              </w:rPr>
+              <w:t xml:space="preserve">SEBM-SR-001</w:t>
+            </w:r>
+          </w:p>
+        </w:tc>
+        <w:tc>
+          <w:tcPr>
+            <w:tcW w:type="dxa" w:w="3000"/>
+            <w:tcBorders>
+              <w:top w:val="single" w:color="999999" w:sz="4"/>
+              <w:left w:val="single" w:color="999999" w:sz="4"/>
+              <w:bottom w:val="single" w:color="999999" w:sz="4"/>
+              <w:right w:val="single" w:color="999999" w:sz="4"/>
+            </w:tcBorders>
+            <w:tcMar>
+              <w:top w:type="dxa" w:w="60"/>
+              <w:left w:type="dxa" w:w="80"/>
+              <w:bottom w:type="dxa" w:w="60"/>
+              <w:right w:type="dxa" w:w="80"/>
+            </w:tcMar>
+            <w:vAlign w:val="center"/>
+          </w:tcPr>
+          <w:p>
+            <w:r>
+              <w:rPr>
+                <w:sz w:val="19"/>
+                <w:szCs w:val="19"/>
+              </w:rPr>
+              <w:t xml:space="preserve">TC-Sec-02</w:t>
+            </w:r>
+          </w:p>
+        </w:tc>
+        <w:tc>
+          <w:tcPr>
+            <w:tcW w:type="dxa" w:w="4628"/>
+            <w:tcBorders>
+              <w:top w:val="single" w:color="999999" w:sz="4"/>
+              <w:left w:val="single" w:color="999999" w:sz="4"/>
+              <w:bottom w:val="single" w:color="999999" w:sz="4"/>
+              <w:right w:val="single" w:color="999999" w:sz="4"/>
+            </w:tcBorders>
+            <w:tcMar>
+              <w:top w:type="dxa" w:w="60"/>
+              <w:left w:type="dxa" w:w="80"/>
+              <w:bottom w:type="dxa" w:w="60"/>
+              <w:right w:type="dxa" w:w="80"/>
+            </w:tcMar>
+            <w:vAlign w:val="center"/>
+          </w:tcPr>
+          <w:p>
+            <w:r>
+              <w:rPr>
+                <w:sz w:val="19"/>
+                <w:szCs w:val="19"/>
+              </w:rPr>
+              <w:t xml:space="preserve">Security</w:t>
+            </w:r>
+          </w:p>
+        </w:tc>
+      </w:tr>
+      <w:tr>
+        <w:tc>
+          <w:tcPr>
+            <w:tcW w:type="dxa" w:w="2600"/>
+            <w:tcBorders>
+              <w:top w:val="single" w:color="999999" w:sz="4"/>
+              <w:left w:val="single" w:color="999999" w:sz="4"/>
+              <w:bottom w:val="single" w:color="999999" w:sz="4"/>
+              <w:right w:val="single" w:color="999999" w:sz="4"/>
+            </w:tcBorders>
+            <w:shd w:fill="F2F2F2" w:val="clear"/>
+            <w:tcMar>
+              <w:top w:type="dxa" w:w="60"/>
+              <w:left w:type="dxa" w:w="80"/>
+              <w:bottom w:type="dxa" w:w="60"/>
+              <w:right w:type="dxa" w:w="80"/>
+            </w:tcMar>
+            <w:vAlign w:val="center"/>
+          </w:tcPr>
+          <w:p>
+            <w:r>
+              <w:rPr>
+                <w:sz w:val="19"/>
+                <w:szCs w:val="19"/>
+              </w:rPr>
+              <w:t xml:space="preserve">SEBM-SR-002</w:t>
+            </w:r>
+          </w:p>
+        </w:tc>
+        <w:tc>
+          <w:tcPr>
+            <w:tcW w:type="dxa" w:w="3000"/>
+            <w:tcBorders>
+              <w:top w:val="single" w:color="999999" w:sz="4"/>
+              <w:left w:val="single" w:color="999999" w:sz="4"/>
+              <w:bottom w:val="single" w:color="999999" w:sz="4"/>
+              <w:right w:val="single" w:color="999999" w:sz="4"/>
+            </w:tcBorders>
+            <w:shd w:fill="F2F2F2" w:val="clear"/>
+            <w:tcMar>
+              <w:top w:type="dxa" w:w="60"/>
+              <w:left w:type="dxa" w:w="80"/>
+              <w:bottom w:type="dxa" w:w="60"/>
+              <w:right w:type="dxa" w:w="80"/>
+            </w:tcMar>
+            <w:vAlign w:val="center"/>
+          </w:tcPr>
+          <w:p>
+            <w:r>
+              <w:rPr>
+                <w:sz w:val="19"/>
+                <w:szCs w:val="19"/>
+              </w:rPr>
+              <w:t xml:space="preserve">TC-Sec-03</w:t>
+            </w:r>
+          </w:p>
+        </w:tc>
+        <w:tc>
+          <w:tcPr>
+            <w:tcW w:type="dxa" w:w="4628"/>
+            <w:tcBorders>
+              <w:top w:val="single" w:color="999999" w:sz="4"/>
+              <w:left w:val="single" w:color="999999" w:sz="4"/>
+              <w:bottom w:val="single" w:color="999999" w:sz="4"/>
+              <w:right w:val="single" w:color="999999" w:sz="4"/>
+            </w:tcBorders>
+            <w:shd w:fill="F2F2F2" w:val="clear"/>
+            <w:tcMar>
+              <w:top w:type="dxa" w:w="60"/>
+              <w:left w:type="dxa" w:w="80"/>
+              <w:bottom w:type="dxa" w:w="60"/>
+              <w:right w:type="dxa" w:w="80"/>
+            </w:tcMar>
+            <w:vAlign w:val="center"/>
+          </w:tcPr>
+          <w:p>
+            <w:r>
+              <w:rPr>
+                <w:sz w:val="19"/>
+                <w:szCs w:val="19"/>
+              </w:rPr>
+              <w:t xml:space="preserve">Security</w:t>
+            </w:r>
+          </w:p>
+        </w:tc>
+      </w:tr>
+      <w:tr>
+        <w:tc>
+          <w:tcPr>
+            <w:tcW w:type="dxa" w:w="2600"/>
+            <w:tcBorders>
+              <w:top w:val="single" w:color="999999" w:sz="4"/>
+              <w:left w:val="single" w:color="999999" w:sz="4"/>
+              <w:bottom w:val="single" w:color="999999" w:sz="4"/>
+              <w:right w:val="single" w:color="999999" w:sz="4"/>
+            </w:tcBorders>
+            <w:tcMar>
+              <w:top w:type="dxa" w:w="60"/>
+              <w:left w:type="dxa" w:w="80"/>
+              <w:bottom w:type="dxa" w:w="60"/>
+              <w:right w:type="dxa" w:w="80"/>
+            </w:tcMar>
+            <w:vAlign w:val="center"/>
+          </w:tcPr>
+          <w:p>
+            <w:r>
+              <w:rPr>
+                <w:sz w:val="19"/>
+                <w:szCs w:val="19"/>
+              </w:rPr>
+              <w:t xml:space="preserve">SEBM-SR-003</w:t>
+            </w:r>
+          </w:p>
+        </w:tc>
+        <w:tc>
+          <w:tcPr>
+            <w:tcW w:type="dxa" w:w="3000"/>
+            <w:tcBorders>
+              <w:top w:val="single" w:color="999999" w:sz="4"/>
+              <w:left w:val="single" w:color="999999" w:sz="4"/>
+              <w:bottom w:val="single" w:color="999999" w:sz="4"/>
+              <w:right w:val="single" w:color="999999" w:sz="4"/>
+            </w:tcBorders>
+            <w:tcMar>
+              <w:top w:type="dxa" w:w="60"/>
+              <w:left w:type="dxa" w:w="80"/>
+              <w:bottom w:type="dxa" w:w="60"/>
+              <w:right w:type="dxa" w:w="80"/>
+            </w:tcMar>
+            <w:vAlign w:val="center"/>
+          </w:tcPr>
+          <w:p>
+            <w:r>
+              <w:rPr>
+                <w:sz w:val="19"/>
+                <w:szCs w:val="19"/>
+              </w:rPr>
+              <w:t xml:space="preserve">TC-Sec-04</w:t>
+            </w:r>
+          </w:p>
+        </w:tc>
+        <w:tc>
+          <w:tcPr>
+            <w:tcW w:type="dxa" w:w="4628"/>
+            <w:tcBorders>
+              <w:top w:val="single" w:color="999999" w:sz="4"/>
+              <w:left w:val="single" w:color="999999" w:sz="4"/>
+              <w:bottom w:val="single" w:color="999999" w:sz="4"/>
+              <w:right w:val="single" w:color="999999" w:sz="4"/>
+            </w:tcBorders>
+            <w:tcMar>
+              <w:top w:type="dxa" w:w="60"/>
+              <w:left w:type="dxa" w:w="80"/>
+              <w:bottom w:type="dxa" w:w="60"/>
+              <w:right w:type="dxa" w:w="80"/>
+            </w:tcMar>
+            <w:vAlign w:val="center"/>
+          </w:tcPr>
+          <w:p>
+            <w:r>
+              <w:rPr>
+                <w:sz w:val="19"/>
+                <w:szCs w:val="19"/>
+              </w:rPr>
+              <w:t xml:space="preserve">Security</w:t>
+            </w:r>
+          </w:p>
+        </w:tc>
+      </w:tr>
+      <w:tr>
+        <w:tc>
+          <w:tcPr>
+            <w:tcW w:type="dxa" w:w="2600"/>
+            <w:tcBorders>
+              <w:top w:val="single" w:color="999999" w:sz="4"/>
+              <w:left w:val="single" w:color="999999" w:sz="4"/>
+              <w:bottom w:val="single" w:color="999999" w:sz="4"/>
+              <w:right w:val="single" w:color="999999" w:sz="4"/>
+            </w:tcBorders>
+            <w:shd w:fill="F2F2F2" w:val="clear"/>
+            <w:tcMar>
+              <w:top w:type="dxa" w:w="60"/>
+              <w:left w:type="dxa" w:w="80"/>
+              <w:bottom w:type="dxa" w:w="60"/>
+              <w:right w:type="dxa" w:w="80"/>
+            </w:tcMar>
+            <w:vAlign w:val="center"/>
+          </w:tcPr>
+          <w:p>
+            <w:r>
+              <w:rPr>
+                <w:sz w:val="19"/>
+                <w:szCs w:val="19"/>
+              </w:rPr>
+              <w:t xml:space="preserve">SEBM-SR-004</w:t>
+            </w:r>
+          </w:p>
+        </w:tc>
+        <w:tc>
+          <w:tcPr>
+            <w:tcW w:type="dxa" w:w="3000"/>
+            <w:tcBorders>
+              <w:top w:val="single" w:color="999999" w:sz="4"/>
+              <w:left w:val="single" w:color="999999" w:sz="4"/>
+              <w:bottom w:val="single" w:color="999999" w:sz="4"/>
+              <w:right w:val="single" w:color="999999" w:sz="4"/>
+            </w:tcBorders>
+            <w:shd w:fill="F2F2F2" w:val="clear"/>
+            <w:tcMar>
+              <w:top w:type="dxa" w:w="60"/>
+              <w:left w:type="dxa" w:w="80"/>
+              <w:bottom w:type="dxa" w:w="60"/>
+              <w:right w:type="dxa" w:w="80"/>
+            </w:tcMar>
+            <w:vAlign w:val="center"/>
+          </w:tcPr>
+          <w:p>
+            <w:r>
+              <w:rPr>
+                <w:sz w:val="19"/>
+                <w:szCs w:val="19"/>
+              </w:rPr>
+              <w:t xml:space="preserve">TC-Sec-05</w:t>
+            </w:r>
+          </w:p>
+        </w:tc>
+        <w:tc>
+          <w:tcPr>
+            <w:tcW w:type="dxa" w:w="4628"/>
+            <w:tcBorders>
+              <w:top w:val="single" w:color="999999" w:sz="4"/>
+              <w:left w:val="single" w:color="999999" w:sz="4"/>
+              <w:bottom w:val="single" w:color="999999" w:sz="4"/>
+              <w:right w:val="single" w:color="999999" w:sz="4"/>
+            </w:tcBorders>
+            <w:shd w:fill="F2F2F2" w:val="clear"/>
+            <w:tcMar>
+              <w:top w:type="dxa" w:w="60"/>
+              <w:left w:type="dxa" w:w="80"/>
+              <w:bottom w:type="dxa" w:w="60"/>
+              <w:right w:type="dxa" w:w="80"/>
+            </w:tcMar>
+            <w:vAlign w:val="center"/>
+          </w:tcPr>
+          <w:p>
+            <w:r>
+              <w:rPr>
+                <w:sz w:val="19"/>
+                <w:szCs w:val="19"/>
+              </w:rPr>
+              <w:t xml:space="preserve">Security</w:t>
+            </w:r>
+          </w:p>
+        </w:tc>
+      </w:tr>
+      <w:tr>
+        <w:tc>
+          <w:tcPr>
+            <w:tcW w:type="dxa" w:w="2600"/>
+            <w:tcBorders>
+              <w:top w:val="single" w:color="999999" w:sz="4"/>
+              <w:left w:val="single" w:color="999999" w:sz="4"/>
+              <w:bottom w:val="single" w:color="999999" w:sz="4"/>
+              <w:right w:val="single" w:color="999999" w:sz="4"/>
+            </w:tcBorders>
+            <w:tcMar>
+              <w:top w:type="dxa" w:w="60"/>
+              <w:left w:type="dxa" w:w="80"/>
+              <w:bottom w:type="dxa" w:w="60"/>
+              <w:right w:type="dxa" w:w="80"/>
+            </w:tcMar>
+            <w:vAlign w:val="center"/>
+          </w:tcPr>
+          <w:p>
+            <w:r>
+              <w:rPr>
+                <w:sz w:val="19"/>
+                <w:szCs w:val="19"/>
+              </w:rPr>
+              <w:t xml:space="preserve">SEBM-SR-005</w:t>
+            </w:r>
+          </w:p>
+        </w:tc>
+        <w:tc>
+          <w:tcPr>
+            <w:tcW w:type="dxa" w:w="3000"/>
+            <w:tcBorders>
+              <w:top w:val="single" w:color="999999" w:sz="4"/>
+              <w:left w:val="single" w:color="999999" w:sz="4"/>
+              <w:bottom w:val="single" w:color="999999" w:sz="4"/>
+              <w:right w:val="single" w:color="999999" w:sz="4"/>
+            </w:tcBorders>
+            <w:tcMar>
+              <w:top w:type="dxa" w:w="60"/>
+              <w:left w:type="dxa" w:w="80"/>
+              <w:bottom w:type="dxa" w:w="60"/>
+              <w:right w:type="dxa" w:w="80"/>
+            </w:tcMar>
+            <w:vAlign w:val="center"/>
+          </w:tcPr>
+          <w:p>
+            <w:r>
+              <w:rPr>
+                <w:sz w:val="19"/>
+                <w:szCs w:val="19"/>
+              </w:rPr>
+              <w:t xml:space="preserve">TC-Sec-06</w:t>
+            </w:r>
+          </w:p>
+        </w:tc>
+        <w:tc>
+          <w:tcPr>
+            <w:tcW w:type="dxa" w:w="4628"/>
+            <w:tcBorders>
+              <w:top w:val="single" w:color="999999" w:sz="4"/>
+              <w:left w:val="single" w:color="999999" w:sz="4"/>
+              <w:bottom w:val="single" w:color="999999" w:sz="4"/>
+              <w:right w:val="single" w:color="999999" w:sz="4"/>
+            </w:tcBorders>
+            <w:tcMar>
+              <w:top w:type="dxa" w:w="60"/>
+              <w:left w:type="dxa" w:w="80"/>
+              <w:bottom w:type="dxa" w:w="60"/>
+              <w:right w:type="dxa" w:w="80"/>
+            </w:tcMar>
+            <w:vAlign w:val="center"/>
+          </w:tcPr>
+          <w:p>
+            <w:r>
+              <w:rPr>
+                <w:sz w:val="19"/>
+                <w:szCs w:val="19"/>
+              </w:rPr>
+              <w:t xml:space="preserve">Security</w:t>
+            </w:r>
+          </w:p>
+        </w:tc>
+      </w:tr>
+    </w:tbl>
     <w:p>
       <w:pPr>
         <w:pStyle w:val="Heading1"/>

</xml_diff>

<commit_message>
Updated Roles and assigned testing modules
</commit_message>
<xml_diff>
--- a/docs/SEBM_Software_Test_Plan.docx
+++ b/docs/SEBM_Software_Test_Plan.docx
@@ -74,7 +74,7 @@
         <w:t xml:space="preserve">Authors: </w:t>
       </w:r>
       <w:r>
-        <w:t xml:space="preserve">QA Team - Taran S (PES2UG24CS555), Suryatej Vojjala (PES2UG24CS541), Sujay P Nayak (PES2UG24CS533), Surya Raju Naik (PES2UG24CS540)</w:t>
+        <w:t xml:space="preserve">Dev A - Taran S (PES2UG24CS555, Scrum Master), Dev B - Suryatej Vojjala (PES2UG24CS541), Dev C - Sujay P Nayak (PES2UG24CS533), Dev D - Surya Raju Naik (PES2UG24CS540)</w:t>
       </w:r>
     </w:p>
     <w:p>
@@ -919,6 +919,21 @@
           <w:b/>
           <w:bCs/>
         </w:rPr>
+        <w:t xml:space="preserve">Test independence: </w:t>
+      </w:r>
+      <w:r>
+        <w:t xml:space="preserve">Every module is tested by a team member who did not develop it (see Section 9). The developer writes unit tests for their own code; the independent tester designs and executes integration/system test cases, raises defects, and confirms acceptance before the story is closed.</w:t>
+      </w:r>
+    </w:p>
+    <w:p>
+      <w:pPr>
+        <w:spacing w:after="120"/>
+      </w:pPr>
+      <w:r>
+        <w:rPr>
+          <w:b/>
+          <w:bCs/>
+        </w:rPr>
         <w:t xml:space="preserve">Entry Criteria: </w:t>
       </w:r>
       <w:r>
@@ -1323,6 +1338,14 @@
           <w:color w:val="1F6391"/>
         </w:rPr>
         <w:t xml:space="preserve">9. Roles and Responsibilities</w:t>
+      </w:r>
+    </w:p>
+    <w:p>
+      <w:pPr>
+        <w:spacing w:after="120"/>
+      </w:pPr>
+      <w:r>
+        <w:t xml:space="preserve">Each team member develops one module and independently tests a module owned by a different member, forming a rotation (A tests B's module, B tests C's, C tests D's, D tests A's).</w:t>
       </w:r>
     </w:p>
     <w:tbl>
@@ -1338,9 +1361,10 @@
         </w:tblBorders>
       </w:tblPr>
       <w:tblGrid>
-        <w:gridCol w:w="2400"/>
-        <w:gridCol w:w="3400"/>
-        <w:gridCol w:w="4428"/>
+        <w:gridCol w:w="1700"/>
+        <w:gridCol w:w="2200"/>
+        <w:gridCol w:w="2300"/>
+        <w:gridCol w:w="4028"/>
       </w:tblGrid>
       <w:tr>
         <w:trPr>
@@ -1348,7 +1372,7 @@
         </w:trPr>
         <w:tc>
           <w:tcPr>
-            <w:tcW w:type="dxa" w:w="2400"/>
+            <w:tcW w:type="dxa" w:w="1700"/>
             <w:tcBorders>
               <w:top w:val="single" w:color="999999" w:sz="4"/>
               <w:left w:val="single" w:color="999999" w:sz="4"/>
@@ -1379,7 +1403,7 @@
         </w:tc>
         <w:tc>
           <w:tcPr>
-            <w:tcW w:type="dxa" w:w="3400"/>
+            <w:tcW w:type="dxa" w:w="2200"/>
             <w:tcBorders>
               <w:top w:val="single" w:color="999999" w:sz="4"/>
               <w:left w:val="single" w:color="999999" w:sz="4"/>
@@ -1410,7 +1434,7 @@
         </w:tc>
         <w:tc>
           <w:tcPr>
-            <w:tcW w:type="dxa" w:w="4428"/>
+            <w:tcW w:type="dxa" w:w="2300"/>
             <w:tcBorders>
               <w:top w:val="single" w:color="999999" w:sz="4"/>
               <w:left w:val="single" w:color="999999" w:sz="4"/>
@@ -1435,7 +1459,38 @@
                 <w:sz w:val="20"/>
                 <w:szCs w:val="20"/>
               </w:rPr>
-              <w:t xml:space="preserve">Responsibility</w:t>
+              <w:t xml:space="preserve">Develops</w:t>
+            </w:r>
+          </w:p>
+        </w:tc>
+        <w:tc>
+          <w:tcPr>
+            <w:tcW w:type="dxa" w:w="4028"/>
+            <w:tcBorders>
+              <w:top w:val="single" w:color="999999" w:sz="4"/>
+              <w:left w:val="single" w:color="999999" w:sz="4"/>
+              <w:bottom w:val="single" w:color="999999" w:sz="4"/>
+              <w:right w:val="single" w:color="999999" w:sz="4"/>
+            </w:tcBorders>
+            <w:shd w:fill="1F6391" w:val="clear"/>
+            <w:tcMar>
+              <w:top w:type="dxa" w:w="60"/>
+              <w:left w:type="dxa" w:w="80"/>
+              <w:bottom w:type="dxa" w:w="60"/>
+              <w:right w:type="dxa" w:w="80"/>
+            </w:tcMar>
+            <w:vAlign w:val="center"/>
+          </w:tcPr>
+          <w:p>
+            <w:r>
+              <w:rPr>
+                <w:b/>
+                <w:bCs/>
+                <w:color w:val="FFFFFF"/>
+                <w:sz w:val="20"/>
+                <w:szCs w:val="20"/>
+              </w:rPr>
+              <w:t xml:space="preserve">Independently tests (and responsibilities)</w:t>
             </w:r>
           </w:p>
         </w:tc>
@@ -1443,34 +1498,34 @@
       <w:tr>
         <w:tc>
           <w:tcPr>
-            <w:tcW w:type="dxa" w:w="2400"/>
-            <w:tcBorders>
-              <w:top w:val="single" w:color="999999" w:sz="4"/>
-              <w:left w:val="single" w:color="999999" w:sz="4"/>
-              <w:bottom w:val="single" w:color="999999" w:sz="4"/>
-              <w:right w:val="single" w:color="999999" w:sz="4"/>
-            </w:tcBorders>
-            <w:tcMar>
-              <w:top w:type="dxa" w:w="60"/>
-              <w:left w:type="dxa" w:w="80"/>
-              <w:bottom w:type="dxa" w:w="60"/>
-              <w:right w:type="dxa" w:w="80"/>
-            </w:tcMar>
-            <w:vAlign w:val="center"/>
-          </w:tcPr>
-          <w:p>
-            <w:r>
-              <w:rPr>
-                <w:sz w:val="19"/>
-                <w:szCs w:val="19"/>
-              </w:rPr>
-              <w:t xml:space="preserve">QA Lead</w:t>
-            </w:r>
-          </w:p>
-        </w:tc>
-        <w:tc>
-          <w:tcPr>
-            <w:tcW w:type="dxa" w:w="3400"/>
+            <w:tcW w:type="dxa" w:w="1700"/>
+            <w:tcBorders>
+              <w:top w:val="single" w:color="999999" w:sz="4"/>
+              <w:left w:val="single" w:color="999999" w:sz="4"/>
+              <w:bottom w:val="single" w:color="999999" w:sz="4"/>
+              <w:right w:val="single" w:color="999999" w:sz="4"/>
+            </w:tcBorders>
+            <w:tcMar>
+              <w:top w:type="dxa" w:w="60"/>
+              <w:left w:type="dxa" w:w="80"/>
+              <w:bottom w:type="dxa" w:w="60"/>
+              <w:right w:type="dxa" w:w="80"/>
+            </w:tcMar>
+            <w:vAlign w:val="center"/>
+          </w:tcPr>
+          <w:p>
+            <w:r>
+              <w:rPr>
+                <w:sz w:val="19"/>
+                <w:szCs w:val="19"/>
+              </w:rPr>
+              <w:t xml:space="preserve">Dev A (Scrum Master)</w:t>
+            </w:r>
+          </w:p>
+        </w:tc>
+        <w:tc>
+          <w:tcPr>
+            <w:tcW w:type="dxa" w:w="2200"/>
             <w:tcBorders>
               <w:top w:val="single" w:color="999999" w:sz="4"/>
               <w:left w:val="single" w:color="999999" w:sz="4"/>
@@ -1497,28 +1552,55 @@
         </w:tc>
         <w:tc>
           <w:tcPr>
-            <w:tcW w:type="dxa" w:w="4428"/>
-            <w:tcBorders>
-              <w:top w:val="single" w:color="999999" w:sz="4"/>
-              <w:left w:val="single" w:color="999999" w:sz="4"/>
-              <w:bottom w:val="single" w:color="999999" w:sz="4"/>
-              <w:right w:val="single" w:color="999999" w:sz="4"/>
-            </w:tcBorders>
-            <w:tcMar>
-              <w:top w:type="dxa" w:w="60"/>
-              <w:left w:type="dxa" w:w="80"/>
-              <w:bottom w:type="dxa" w:w="60"/>
-              <w:right w:type="dxa" w:w="80"/>
-            </w:tcMar>
-            <w:vAlign w:val="center"/>
-          </w:tcPr>
-          <w:p>
-            <w:r>
-              <w:rPr>
-                <w:sz w:val="19"/>
-                <w:szCs w:val="19"/>
-              </w:rPr>
-              <w:t xml:space="preserve">Prepare test plan, coordinate execution across modules</w:t>
+            <w:tcW w:type="dxa" w:w="2300"/>
+            <w:tcBorders>
+              <w:top w:val="single" w:color="999999" w:sz="4"/>
+              <w:left w:val="single" w:color="999999" w:sz="4"/>
+              <w:bottom w:val="single" w:color="999999" w:sz="4"/>
+              <w:right w:val="single" w:color="999999" w:sz="4"/>
+            </w:tcBorders>
+            <w:tcMar>
+              <w:top w:type="dxa" w:w="60"/>
+              <w:left w:type="dxa" w:w="80"/>
+              <w:bottom w:type="dxa" w:w="60"/>
+              <w:right w:type="dxa" w:w="80"/>
+            </w:tcMar>
+            <w:vAlign w:val="center"/>
+          </w:tcPr>
+          <w:p>
+            <w:r>
+              <w:rPr>
+                <w:sz w:val="19"/>
+                <w:szCs w:val="19"/>
+              </w:rPr>
+              <w:t xml:space="preserve">Expense/Income Tracking &amp; Accounts</w:t>
+            </w:r>
+          </w:p>
+        </w:tc>
+        <w:tc>
+          <w:tcPr>
+            <w:tcW w:type="dxa" w:w="4028"/>
+            <w:tcBorders>
+              <w:top w:val="single" w:color="999999" w:sz="4"/>
+              <w:left w:val="single" w:color="999999" w:sz="4"/>
+              <w:bottom w:val="single" w:color="999999" w:sz="4"/>
+              <w:right w:val="single" w:color="999999" w:sz="4"/>
+            </w:tcBorders>
+            <w:tcMar>
+              <w:top w:type="dxa" w:w="60"/>
+              <w:left w:type="dxa" w:w="80"/>
+              <w:bottom w:type="dxa" w:w="60"/>
+              <w:right w:type="dxa" w:w="80"/>
+            </w:tcMar>
+            <w:vAlign w:val="center"/>
+          </w:tcPr>
+          <w:p>
+            <w:r>
+              <w:rPr>
+                <w:sz w:val="19"/>
+                <w:szCs w:val="19"/>
+              </w:rPr>
+              <w:t xml:space="preserve">Registration &amp; Authentication (Dev B) - SEBM-F-001..003, SEBM-SR-002, SEBM-SR-004. Also prepares the test plan, facilitates sprint events, reviews and merges PRs.</w:t>
             </w:r>
           </w:p>
         </w:tc>
@@ -1526,7 +1608,7 @@
       <w:tr>
         <w:tc>
           <w:tcPr>
-            <w:tcW w:type="dxa" w:w="2400"/>
+            <w:tcW w:type="dxa" w:w="1700"/>
             <w:tcBorders>
               <w:top w:val="single" w:color="999999" w:sz="4"/>
               <w:left w:val="single" w:color="999999" w:sz="4"/>
@@ -1548,13 +1630,13 @@
                 <w:sz w:val="19"/>
                 <w:szCs w:val="19"/>
               </w:rPr>
-              <w:t xml:space="preserve">Test Engineer</w:t>
-            </w:r>
-          </w:p>
-        </w:tc>
-        <w:tc>
-          <w:tcPr>
-            <w:tcW w:type="dxa" w:w="3400"/>
+              <w:t xml:space="preserve">Dev B</w:t>
+            </w:r>
+          </w:p>
+        </w:tc>
+        <w:tc>
+          <w:tcPr>
+            <w:tcW w:type="dxa" w:w="2200"/>
             <w:tcBorders>
               <w:top w:val="single" w:color="999999" w:sz="4"/>
               <w:left w:val="single" w:color="999999" w:sz="4"/>
@@ -1582,7 +1664,7 @@
         </w:tc>
         <w:tc>
           <w:tcPr>
-            <w:tcW w:type="dxa" w:w="4428"/>
+            <w:tcW w:type="dxa" w:w="2300"/>
             <w:tcBorders>
               <w:top w:val="single" w:color="999999" w:sz="4"/>
               <w:left w:val="single" w:color="999999" w:sz="4"/>
@@ -1604,7 +1686,35 @@
                 <w:sz w:val="19"/>
                 <w:szCs w:val="19"/>
               </w:rPr>
-              <w:t xml:space="preserve">Design &amp; execute test cases for Registration &amp; Authentication; log defects</w:t>
+              <w:t xml:space="preserve">Registration &amp; Authentication</w:t>
+            </w:r>
+          </w:p>
+        </w:tc>
+        <w:tc>
+          <w:tcPr>
+            <w:tcW w:type="dxa" w:w="4028"/>
+            <w:tcBorders>
+              <w:top w:val="single" w:color="999999" w:sz="4"/>
+              <w:left w:val="single" w:color="999999" w:sz="4"/>
+              <w:bottom w:val="single" w:color="999999" w:sz="4"/>
+              <w:right w:val="single" w:color="999999" w:sz="4"/>
+            </w:tcBorders>
+            <w:shd w:fill="F2F2F2" w:val="clear"/>
+            <w:tcMar>
+              <w:top w:type="dxa" w:w="60"/>
+              <w:left w:type="dxa" w:w="80"/>
+              <w:bottom w:type="dxa" w:w="60"/>
+              <w:right w:type="dxa" w:w="80"/>
+            </w:tcMar>
+            <w:vAlign w:val="center"/>
+          </w:tcPr>
+          <w:p>
+            <w:r>
+              <w:rPr>
+                <w:sz w:val="19"/>
+                <w:szCs w:val="19"/>
+              </w:rPr>
+              <w:t xml:space="preserve">Budget Management &amp; Reports/Analytics (Dev C) - SEBM-F-020..022, SEBM-F-040..042. Designs and executes test cases; logs defects.</w:t>
             </w:r>
           </w:p>
         </w:tc>
@@ -1612,34 +1722,34 @@
       <w:tr>
         <w:tc>
           <w:tcPr>
-            <w:tcW w:type="dxa" w:w="2400"/>
-            <w:tcBorders>
-              <w:top w:val="single" w:color="999999" w:sz="4"/>
-              <w:left w:val="single" w:color="999999" w:sz="4"/>
-              <w:bottom w:val="single" w:color="999999" w:sz="4"/>
-              <w:right w:val="single" w:color="999999" w:sz="4"/>
-            </w:tcBorders>
-            <w:tcMar>
-              <w:top w:type="dxa" w:w="60"/>
-              <w:left w:type="dxa" w:w="80"/>
-              <w:bottom w:type="dxa" w:w="60"/>
-              <w:right w:type="dxa" w:w="80"/>
-            </w:tcMar>
-            <w:vAlign w:val="center"/>
-          </w:tcPr>
-          <w:p>
-            <w:r>
-              <w:rPr>
-                <w:sz w:val="19"/>
-                <w:szCs w:val="19"/>
-              </w:rPr>
-              <w:t xml:space="preserve">Test Engineer</w:t>
-            </w:r>
-          </w:p>
-        </w:tc>
-        <w:tc>
-          <w:tcPr>
-            <w:tcW w:type="dxa" w:w="3400"/>
+            <w:tcW w:type="dxa" w:w="1700"/>
+            <w:tcBorders>
+              <w:top w:val="single" w:color="999999" w:sz="4"/>
+              <w:left w:val="single" w:color="999999" w:sz="4"/>
+              <w:bottom w:val="single" w:color="999999" w:sz="4"/>
+              <w:right w:val="single" w:color="999999" w:sz="4"/>
+            </w:tcBorders>
+            <w:tcMar>
+              <w:top w:type="dxa" w:w="60"/>
+              <w:left w:type="dxa" w:w="80"/>
+              <w:bottom w:type="dxa" w:w="60"/>
+              <w:right w:type="dxa" w:w="80"/>
+            </w:tcMar>
+            <w:vAlign w:val="center"/>
+          </w:tcPr>
+          <w:p>
+            <w:r>
+              <w:rPr>
+                <w:sz w:val="19"/>
+                <w:szCs w:val="19"/>
+              </w:rPr>
+              <w:t xml:space="preserve">Dev C</w:t>
+            </w:r>
+          </w:p>
+        </w:tc>
+        <w:tc>
+          <w:tcPr>
+            <w:tcW w:type="dxa" w:w="2200"/>
             <w:tcBorders>
               <w:top w:val="single" w:color="999999" w:sz="4"/>
               <w:left w:val="single" w:color="999999" w:sz="4"/>
@@ -1666,28 +1776,55 @@
         </w:tc>
         <w:tc>
           <w:tcPr>
-            <w:tcW w:type="dxa" w:w="4428"/>
-            <w:tcBorders>
-              <w:top w:val="single" w:color="999999" w:sz="4"/>
-              <w:left w:val="single" w:color="999999" w:sz="4"/>
-              <w:bottom w:val="single" w:color="999999" w:sz="4"/>
-              <w:right w:val="single" w:color="999999" w:sz="4"/>
-            </w:tcBorders>
-            <w:tcMar>
-              <w:top w:type="dxa" w:w="60"/>
-              <w:left w:type="dxa" w:w="80"/>
-              <w:bottom w:type="dxa" w:w="60"/>
-              <w:right w:type="dxa" w:w="80"/>
-            </w:tcMar>
-            <w:vAlign w:val="center"/>
-          </w:tcPr>
-          <w:p>
-            <w:r>
-              <w:rPr>
-                <w:sz w:val="19"/>
-                <w:szCs w:val="19"/>
-              </w:rPr>
-              <w:t xml:space="preserve">Design &amp; execute test cases for Budget Management and Reports/Analytics; log defects</w:t>
+            <w:tcW w:type="dxa" w:w="2300"/>
+            <w:tcBorders>
+              <w:top w:val="single" w:color="999999" w:sz="4"/>
+              <w:left w:val="single" w:color="999999" w:sz="4"/>
+              <w:bottom w:val="single" w:color="999999" w:sz="4"/>
+              <w:right w:val="single" w:color="999999" w:sz="4"/>
+            </w:tcBorders>
+            <w:tcMar>
+              <w:top w:type="dxa" w:w="60"/>
+              <w:left w:type="dxa" w:w="80"/>
+              <w:bottom w:type="dxa" w:w="60"/>
+              <w:right w:type="dxa" w:w="80"/>
+            </w:tcMar>
+            <w:vAlign w:val="center"/>
+          </w:tcPr>
+          <w:p>
+            <w:r>
+              <w:rPr>
+                <w:sz w:val="19"/>
+                <w:szCs w:val="19"/>
+              </w:rPr>
+              <w:t xml:space="preserve">Budget Management &amp; Reports/Analytics</w:t>
+            </w:r>
+          </w:p>
+        </w:tc>
+        <w:tc>
+          <w:tcPr>
+            <w:tcW w:type="dxa" w:w="4028"/>
+            <w:tcBorders>
+              <w:top w:val="single" w:color="999999" w:sz="4"/>
+              <w:left w:val="single" w:color="999999" w:sz="4"/>
+              <w:bottom w:val="single" w:color="999999" w:sz="4"/>
+              <w:right w:val="single" w:color="999999" w:sz="4"/>
+            </w:tcBorders>
+            <w:tcMar>
+              <w:top w:type="dxa" w:w="60"/>
+              <w:left w:type="dxa" w:w="80"/>
+              <w:bottom w:type="dxa" w:w="60"/>
+              <w:right w:type="dxa" w:w="80"/>
+            </w:tcMar>
+            <w:vAlign w:val="center"/>
+          </w:tcPr>
+          <w:p>
+            <w:r>
+              <w:rPr>
+                <w:sz w:val="19"/>
+                <w:szCs w:val="19"/>
+              </w:rPr>
+              <w:t xml:space="preserve">Notifications &amp; Security/NFRs (Dev D) - SEBM-F-050..051, SEBM-NF-001..005, SEBM-SR-001, SEBM-SR-003, SEBM-SR-005. Designs and executes test cases; logs defects.</w:t>
             </w:r>
           </w:p>
         </w:tc>
@@ -1695,7 +1832,7 @@
       <w:tr>
         <w:tc>
           <w:tcPr>
-            <w:tcW w:type="dxa" w:w="2400"/>
+            <w:tcW w:type="dxa" w:w="1700"/>
             <w:tcBorders>
               <w:top w:val="single" w:color="999999" w:sz="4"/>
               <w:left w:val="single" w:color="999999" w:sz="4"/>
@@ -1717,13 +1854,13 @@
                 <w:sz w:val="19"/>
                 <w:szCs w:val="19"/>
               </w:rPr>
-              <w:t xml:space="preserve">Test Engineer</w:t>
-            </w:r>
-          </w:p>
-        </w:tc>
-        <w:tc>
-          <w:tcPr>
-            <w:tcW w:type="dxa" w:w="3400"/>
+              <w:t xml:space="preserve">Dev D</w:t>
+            </w:r>
+          </w:p>
+        </w:tc>
+        <w:tc>
+          <w:tcPr>
+            <w:tcW w:type="dxa" w:w="2200"/>
             <w:tcBorders>
               <w:top w:val="single" w:color="999999" w:sz="4"/>
               <w:left w:val="single" w:color="999999" w:sz="4"/>
@@ -1751,7 +1888,7 @@
         </w:tc>
         <w:tc>
           <w:tcPr>
-            <w:tcW w:type="dxa" w:w="4428"/>
+            <w:tcW w:type="dxa" w:w="2300"/>
             <w:tcBorders>
               <w:top w:val="single" w:color="999999" w:sz="4"/>
               <w:left w:val="single" w:color="999999" w:sz="4"/>
@@ -1773,7 +1910,35 @@
                 <w:sz w:val="19"/>
                 <w:szCs w:val="19"/>
               </w:rPr>
-              <w:t xml:space="preserve">Design &amp; execute test cases for Notifications and Security/NFRs; log defects</w:t>
+              <w:t xml:space="preserve">Notifications &amp; Security/NFRs</w:t>
+            </w:r>
+          </w:p>
+        </w:tc>
+        <w:tc>
+          <w:tcPr>
+            <w:tcW w:type="dxa" w:w="4028"/>
+            <w:tcBorders>
+              <w:top w:val="single" w:color="999999" w:sz="4"/>
+              <w:left w:val="single" w:color="999999" w:sz="4"/>
+              <w:bottom w:val="single" w:color="999999" w:sz="4"/>
+              <w:right w:val="single" w:color="999999" w:sz="4"/>
+            </w:tcBorders>
+            <w:shd w:fill="F2F2F2" w:val="clear"/>
+            <w:tcMar>
+              <w:top w:type="dxa" w:w="60"/>
+              <w:left w:type="dxa" w:w="80"/>
+              <w:bottom w:type="dxa" w:w="60"/>
+              <w:right w:type="dxa" w:w="80"/>
+            </w:tcMar>
+            <w:vAlign w:val="center"/>
+          </w:tcPr>
+          <w:p>
+            <w:r>
+              <w:rPr>
+                <w:sz w:val="19"/>
+                <w:szCs w:val="19"/>
+              </w:rPr>
+              <w:t xml:space="preserve">Expense/Income Tracking &amp; Accounts (Dev A) - SEBM-F-010..013, SEBM-F-030..031. Designs and executes test cases; logs defects.</w:t>
             </w:r>
           </w:p>
         </w:tc>
@@ -1781,97 +1946,13 @@
       <w:tr>
         <w:tc>
           <w:tcPr>
-            <w:tcW w:type="dxa" w:w="2400"/>
-            <w:tcBorders>
-              <w:top w:val="single" w:color="999999" w:sz="4"/>
-              <w:left w:val="single" w:color="999999" w:sz="4"/>
-              <w:bottom w:val="single" w:color="999999" w:sz="4"/>
-              <w:right w:val="single" w:color="999999" w:sz="4"/>
-            </w:tcBorders>
-            <w:tcMar>
-              <w:top w:type="dxa" w:w="60"/>
-              <w:left w:type="dxa" w:w="80"/>
-              <w:bottom w:type="dxa" w:w="60"/>
-              <w:right w:type="dxa" w:w="80"/>
-            </w:tcMar>
-            <w:vAlign w:val="center"/>
-          </w:tcPr>
-          <w:p>
-            <w:r>
-              <w:rPr>
-                <w:sz w:val="19"/>
-                <w:szCs w:val="19"/>
-              </w:rPr>
-              <w:t xml:space="preserve">Developer</w:t>
-            </w:r>
-          </w:p>
-        </w:tc>
-        <w:tc>
-          <w:tcPr>
-            <w:tcW w:type="dxa" w:w="3400"/>
-            <w:tcBorders>
-              <w:top w:val="single" w:color="999999" w:sz="4"/>
-              <w:left w:val="single" w:color="999999" w:sz="4"/>
-              <w:bottom w:val="single" w:color="999999" w:sz="4"/>
-              <w:right w:val="single" w:color="999999" w:sz="4"/>
-            </w:tcBorders>
-            <w:tcMar>
-              <w:top w:type="dxa" w:w="60"/>
-              <w:left w:type="dxa" w:w="80"/>
-              <w:bottom w:type="dxa" w:w="60"/>
-              <w:right w:type="dxa" w:w="80"/>
-            </w:tcMar>
-            <w:vAlign w:val="center"/>
-          </w:tcPr>
-          <w:p>
-            <w:r>
-              <w:rPr>
-                <w:sz w:val="19"/>
-                <w:szCs w:val="19"/>
-              </w:rPr>
-              <w:t xml:space="preserve">Project Team</w:t>
-            </w:r>
-          </w:p>
-        </w:tc>
-        <w:tc>
-          <w:tcPr>
-            <w:tcW w:type="dxa" w:w="4428"/>
-            <w:tcBorders>
-              <w:top w:val="single" w:color="999999" w:sz="4"/>
-              <w:left w:val="single" w:color="999999" w:sz="4"/>
-              <w:bottom w:val="single" w:color="999999" w:sz="4"/>
-              <w:right w:val="single" w:color="999999" w:sz="4"/>
-            </w:tcBorders>
-            <w:tcMar>
-              <w:top w:type="dxa" w:w="60"/>
-              <w:left w:type="dxa" w:w="80"/>
-              <w:bottom w:type="dxa" w:w="60"/>
-              <w:right w:type="dxa" w:w="80"/>
-            </w:tcMar>
-            <w:vAlign w:val="center"/>
-          </w:tcPr>
-          <w:p>
-            <w:r>
-              <w:rPr>
-                <w:sz w:val="19"/>
-                <w:szCs w:val="19"/>
-              </w:rPr>
-              <w:t xml:space="preserve">Support defect fixes and triage across modules</w:t>
-            </w:r>
-          </w:p>
-        </w:tc>
-      </w:tr>
-      <w:tr>
-        <w:tc>
-          <w:tcPr>
-            <w:tcW w:type="dxa" w:w="2400"/>
-            <w:tcBorders>
-              <w:top w:val="single" w:color="999999" w:sz="4"/>
-              <w:left w:val="single" w:color="999999" w:sz="4"/>
-              <w:bottom w:val="single" w:color="999999" w:sz="4"/>
-              <w:right w:val="single" w:color="999999" w:sz="4"/>
-            </w:tcBorders>
-            <w:shd w:fill="F2F2F2" w:val="clear"/>
+            <w:tcW w:type="dxa" w:w="1700"/>
+            <w:tcBorders>
+              <w:top w:val="single" w:color="999999" w:sz="4"/>
+              <w:left w:val="single" w:color="999999" w:sz="4"/>
+              <w:bottom w:val="single" w:color="999999" w:sz="4"/>
+              <w:right w:val="single" w:color="999999" w:sz="4"/>
+            </w:tcBorders>
             <w:tcMar>
               <w:top w:type="dxa" w:w="60"/>
               <w:left w:type="dxa" w:w="80"/>
@@ -1892,14 +1973,13 @@
         </w:tc>
         <w:tc>
           <w:tcPr>
-            <w:tcW w:type="dxa" w:w="3400"/>
-            <w:tcBorders>
-              <w:top w:val="single" w:color="999999" w:sz="4"/>
-              <w:left w:val="single" w:color="999999" w:sz="4"/>
-              <w:bottom w:val="single" w:color="999999" w:sz="4"/>
-              <w:right w:val="single" w:color="999999" w:sz="4"/>
-            </w:tcBorders>
-            <w:shd w:fill="F2F2F2" w:val="clear"/>
+            <w:tcW w:type="dxa" w:w="2200"/>
+            <w:tcBorders>
+              <w:top w:val="single" w:color="999999" w:sz="4"/>
+              <w:left w:val="single" w:color="999999" w:sz="4"/>
+              <w:bottom w:val="single" w:color="999999" w:sz="4"/>
+              <w:right w:val="single" w:color="999999" w:sz="4"/>
+            </w:tcBorders>
             <w:tcMar>
               <w:top w:type="dxa" w:w="60"/>
               <w:left w:type="dxa" w:w="80"/>
@@ -1920,14 +2000,40 @@
         </w:tc>
         <w:tc>
           <w:tcPr>
-            <w:tcW w:type="dxa" w:w="4428"/>
-            <w:tcBorders>
-              <w:top w:val="single" w:color="999999" w:sz="4"/>
-              <w:left w:val="single" w:color="999999" w:sz="4"/>
-              <w:bottom w:val="single" w:color="999999" w:sz="4"/>
-              <w:right w:val="single" w:color="999999" w:sz="4"/>
-            </w:tcBorders>
-            <w:shd w:fill="F2F2F2" w:val="clear"/>
+            <w:tcW w:type="dxa" w:w="2300"/>
+            <w:tcBorders>
+              <w:top w:val="single" w:color="999999" w:sz="4"/>
+              <w:left w:val="single" w:color="999999" w:sz="4"/>
+              <w:bottom w:val="single" w:color="999999" w:sz="4"/>
+              <w:right w:val="single" w:color="999999" w:sz="4"/>
+            </w:tcBorders>
+            <w:tcMar>
+              <w:top w:type="dxa" w:w="60"/>
+              <w:left w:type="dxa" w:w="80"/>
+              <w:bottom w:type="dxa" w:w="60"/>
+              <w:right w:type="dxa" w:w="80"/>
+            </w:tcMar>
+            <w:vAlign w:val="center"/>
+          </w:tcPr>
+          <w:p>
+            <w:r>
+              <w:rPr>
+                <w:sz w:val="19"/>
+                <w:szCs w:val="19"/>
+              </w:rPr>
+              <w:t xml:space="preserve">-</w:t>
+            </w:r>
+          </w:p>
+        </w:tc>
+        <w:tc>
+          <w:tcPr>
+            <w:tcW w:type="dxa" w:w="4028"/>
+            <w:tcBorders>
+              <w:top w:val="single" w:color="999999" w:sz="4"/>
+              <w:left w:val="single" w:color="999999" w:sz="4"/>
+              <w:bottom w:val="single" w:color="999999" w:sz="4"/>
+              <w:right w:val="single" w:color="999999" w:sz="4"/>
+            </w:tcBorders>
             <w:tcMar>
               <w:top w:type="dxa" w:w="60"/>
               <w:left w:type="dxa" w:w="80"/>
@@ -5170,7 +5276,7 @@
                 <w:sz w:val="19"/>
                 <w:szCs w:val="19"/>
               </w:rPr>
-              <w:t xml:space="preserve">QA Lead</w:t>
+              <w:t xml:space="preserve">Dev A (Scrum Master)</w:t>
             </w:r>
           </w:p>
         </w:tc>
@@ -5254,7 +5360,7 @@
                 <w:sz w:val="19"/>
                 <w:szCs w:val="19"/>
               </w:rPr>
-              <w:t xml:space="preserve">Dev Lead</w:t>
+              <w:t xml:space="preserve">Dev B</w:t>
             </w:r>
           </w:p>
         </w:tc>
@@ -5283,6 +5389,175 @@
                 <w:szCs w:val="19"/>
               </w:rPr>
               <w:t xml:space="preserve">Suryatej Vojjala</w:t>
+            </w:r>
+          </w:p>
+        </w:tc>
+        <w:tc>
+          <w:tcPr>
+            <w:tcW w:type="dxa" w:w="3428"/>
+            <w:tcBorders>
+              <w:top w:val="single" w:color="999999" w:sz="4"/>
+              <w:left w:val="single" w:color="999999" w:sz="4"/>
+              <w:bottom w:val="single" w:color="999999" w:sz="4"/>
+              <w:right w:val="single" w:color="999999" w:sz="4"/>
+            </w:tcBorders>
+            <w:shd w:fill="F2F2F2" w:val="clear"/>
+            <w:tcMar>
+              <w:top w:type="dxa" w:w="60"/>
+              <w:left w:type="dxa" w:w="80"/>
+              <w:bottom w:type="dxa" w:w="60"/>
+              <w:right w:type="dxa" w:w="80"/>
+            </w:tcMar>
+            <w:vAlign w:val="center"/>
+          </w:tcPr>
+          <w:p>
+            <w:r>
+              <w:rPr>
+                <w:sz w:val="19"/>
+                <w:szCs w:val="19"/>
+              </w:rPr>
+              <w:t xml:space="preserve"/>
+            </w:r>
+          </w:p>
+        </w:tc>
+      </w:tr>
+      <w:tr>
+        <w:tc>
+          <w:tcPr>
+            <w:tcW w:type="dxa" w:w="2400"/>
+            <w:tcBorders>
+              <w:top w:val="single" w:color="999999" w:sz="4"/>
+              <w:left w:val="single" w:color="999999" w:sz="4"/>
+              <w:bottom w:val="single" w:color="999999" w:sz="4"/>
+              <w:right w:val="single" w:color="999999" w:sz="4"/>
+            </w:tcBorders>
+            <w:tcMar>
+              <w:top w:type="dxa" w:w="60"/>
+              <w:left w:type="dxa" w:w="80"/>
+              <w:bottom w:type="dxa" w:w="60"/>
+              <w:right w:type="dxa" w:w="80"/>
+            </w:tcMar>
+            <w:vAlign w:val="center"/>
+          </w:tcPr>
+          <w:p>
+            <w:r>
+              <w:rPr>
+                <w:sz w:val="19"/>
+                <w:szCs w:val="19"/>
+              </w:rPr>
+              <w:t xml:space="preserve">Dev C</w:t>
+            </w:r>
+          </w:p>
+        </w:tc>
+        <w:tc>
+          <w:tcPr>
+            <w:tcW w:type="dxa" w:w="4400"/>
+            <w:tcBorders>
+              <w:top w:val="single" w:color="999999" w:sz="4"/>
+              <w:left w:val="single" w:color="999999" w:sz="4"/>
+              <w:bottom w:val="single" w:color="999999" w:sz="4"/>
+              <w:right w:val="single" w:color="999999" w:sz="4"/>
+            </w:tcBorders>
+            <w:tcMar>
+              <w:top w:type="dxa" w:w="60"/>
+              <w:left w:type="dxa" w:w="80"/>
+              <w:bottom w:type="dxa" w:w="60"/>
+              <w:right w:type="dxa" w:w="80"/>
+            </w:tcMar>
+            <w:vAlign w:val="center"/>
+          </w:tcPr>
+          <w:p>
+            <w:r>
+              <w:rPr>
+                <w:sz w:val="19"/>
+                <w:szCs w:val="19"/>
+              </w:rPr>
+              <w:t xml:space="preserve">Sujay P Nayak</w:t>
+            </w:r>
+          </w:p>
+        </w:tc>
+        <w:tc>
+          <w:tcPr>
+            <w:tcW w:type="dxa" w:w="3428"/>
+            <w:tcBorders>
+              <w:top w:val="single" w:color="999999" w:sz="4"/>
+              <w:left w:val="single" w:color="999999" w:sz="4"/>
+              <w:bottom w:val="single" w:color="999999" w:sz="4"/>
+              <w:right w:val="single" w:color="999999" w:sz="4"/>
+            </w:tcBorders>
+            <w:tcMar>
+              <w:top w:type="dxa" w:w="60"/>
+              <w:left w:type="dxa" w:w="80"/>
+              <w:bottom w:type="dxa" w:w="60"/>
+              <w:right w:type="dxa" w:w="80"/>
+            </w:tcMar>
+            <w:vAlign w:val="center"/>
+          </w:tcPr>
+          <w:p>
+            <w:r>
+              <w:rPr>
+                <w:sz w:val="19"/>
+                <w:szCs w:val="19"/>
+              </w:rPr>
+              <w:t xml:space="preserve"/>
+            </w:r>
+          </w:p>
+        </w:tc>
+      </w:tr>
+      <w:tr>
+        <w:tc>
+          <w:tcPr>
+            <w:tcW w:type="dxa" w:w="2400"/>
+            <w:tcBorders>
+              <w:top w:val="single" w:color="999999" w:sz="4"/>
+              <w:left w:val="single" w:color="999999" w:sz="4"/>
+              <w:bottom w:val="single" w:color="999999" w:sz="4"/>
+              <w:right w:val="single" w:color="999999" w:sz="4"/>
+            </w:tcBorders>
+            <w:shd w:fill="F2F2F2" w:val="clear"/>
+            <w:tcMar>
+              <w:top w:type="dxa" w:w="60"/>
+              <w:left w:type="dxa" w:w="80"/>
+              <w:bottom w:type="dxa" w:w="60"/>
+              <w:right w:type="dxa" w:w="80"/>
+            </w:tcMar>
+            <w:vAlign w:val="center"/>
+          </w:tcPr>
+          <w:p>
+            <w:r>
+              <w:rPr>
+                <w:sz w:val="19"/>
+                <w:szCs w:val="19"/>
+              </w:rPr>
+              <w:t xml:space="preserve">Dev D</w:t>
+            </w:r>
+          </w:p>
+        </w:tc>
+        <w:tc>
+          <w:tcPr>
+            <w:tcW w:type="dxa" w:w="4400"/>
+            <w:tcBorders>
+              <w:top w:val="single" w:color="999999" w:sz="4"/>
+              <w:left w:val="single" w:color="999999" w:sz="4"/>
+              <w:bottom w:val="single" w:color="999999" w:sz="4"/>
+              <w:right w:val="single" w:color="999999" w:sz="4"/>
+            </w:tcBorders>
+            <w:shd w:fill="F2F2F2" w:val="clear"/>
+            <w:tcMar>
+              <w:top w:type="dxa" w:w="60"/>
+              <w:left w:type="dxa" w:w="80"/>
+              <w:bottom w:type="dxa" w:w="60"/>
+              <w:right w:type="dxa" w:w="80"/>
+            </w:tcMar>
+            <w:vAlign w:val="center"/>
+          </w:tcPr>
+          <w:p>
+            <w:r>
+              <w:rPr>
+                <w:sz w:val="19"/>
+                <w:szCs w:val="19"/>
+              </w:rPr>
+              <w:t xml:space="preserve">Surya Raju Naik</w:t>
             </w:r>
           </w:p>
         </w:tc>

</xml_diff>